<commit_message>
Record the registration/MFA-bypass fix in MASTER_PROJECT_CONTEXT.docx
Adds a "Registration must not seed trust history (added 2026-09-10)"
subsection to Section 7, alongside the Module 7 forward-looking note,
recording the constraint behind the fix in the previous two commits
(8a3abf0, 86a1535): a successful registration must return only a
created account, never an authenticated session, so Module 5/6's risk
check always evaluates the account's true first login from a clean
history. Points to Project status.md section 12 for the full
root-cause trace and verification. Regenerated from the updated
Projects-tool content, so this disk copy and the Projects-tool doc
match.

Co-Authored-By: Claude Sonnet 5 <noreply@anthropic.com>
Claude-Session: https://claude.ai/code/session_01EJVE4Sxiq9Efn6XjnuTBt9
</commit_message>
<xml_diff>
--- a/MASTER_PROJECT_CONTEXT.docx
+++ b/MASTER_PROJECT_CONTEXT.docx
@@ -2416,6 +2416,95 @@
       </w:pPr>
       <w:r>
         <w:t xml:space="preserve">Module 7's continuous/re-verification challenges (not yet built) are expected to reuse this same emailed one-time-code mechanism when a re-verification is needed during an active session, rather than introducing TOTP or any other new MFA method at that point. This is a forward-looking constraint recorded now so Module 7's design does not have to re-litigate the MFA-method question later.</w:t>
+      </w:r>
+    </w:p>
+    <w:p>
+      <w:pPr>
+        <w:pStyle w:val="Heading2"/>
+        <w:spacing w:after="120" w:before="200"/>
+      </w:pPr>
+      <w:r>
+        <w:t xml:space="preserve">Registration must not seed trust history (added 2026-09-10)</w:t>
+      </w:r>
+    </w:p>
+    <w:p>
+      <w:pPr>
+        <w:spacing w:after="160"/>
+      </w:pPr>
+      <w:r>
+        <w:rPr>
+          <w:b/>
+          <w:bCs/>
+        </w:rPr>
+        <w:t xml:space="preserve">Diagnosed and fixed 2026-09-10 — see `Project status.md` section 12 for the full root-cause trace.</w:t>
+      </w:r>
+      <w:r>
+        <w:t xml:space="preserve"> Registering an account (</w:t>
+      </w:r>
+      <w:r>
+        <w:rPr>
+          <w:rFonts w:ascii="Consolas" w:cs="Consolas" w:eastAsia="Consolas" w:hAnsi="Consolas"/>
+          <w:shd w:fill="EFEFEF" w:val="clear"/>
+        </w:rPr>
+        <w:t xml:space="preserve">POST /auth/register</w:t>
+      </w:r>
+      <w:r>
+        <w:t xml:space="preserve">) is deliberately not MFA-gated (Section 3/13's "no MFA gate on registration" line), but the application layer must not treat a successful registration as an authenticated session in the same sense a real login is. Doing so — specifically, opening the app's WebSocket session immediately after registering — lets that session's device/IP seed Module 5's </w:t>
+      </w:r>
+      <w:r>
+        <w:rPr>
+          <w:rFonts w:ascii="Consolas" w:cs="Consolas" w:eastAsia="Consolas" w:hAnsi="Consolas"/>
+          <w:shd w:fill="EFEFEF" w:val="clear"/>
+        </w:rPr>
+        <w:t xml:space="preserve">known_device</w:t>
+      </w:r>
+      <w:r>
+        <w:t xml:space="preserve">/</w:t>
+      </w:r>
+      <w:r>
+        <w:rPr>
+          <w:rFonts w:ascii="Consolas" w:cs="Consolas" w:eastAsia="Consolas" w:hAnsi="Consolas"/>
+          <w:shd w:fill="EFEFEF" w:val="clear"/>
+        </w:rPr>
+        <w:t xml:space="preserve">known_ip</w:t>
+      </w:r>
+      <w:r>
+        <w:t xml:space="preserve"> trust history before the account's first real login ever runs the Section 6 risk check, which can push that "first" login's score past the LOW threshold and skip the MFA challenge it is supposed to get. This defeats the guarantee in Section 6 that a genuinely first-ever login always lands in MEDIUM risk.</w:t>
+      </w:r>
+    </w:p>
+    <w:p>
+      <w:pPr>
+        <w:spacing w:after="160"/>
+      </w:pPr>
+      <w:r>
+        <w:rPr>
+          <w:b/>
+          <w:bCs/>
+        </w:rPr>
+        <w:t xml:space="preserve">Constraint going forward</w:t>
+      </w:r>
+      <w:r>
+        <w:t xml:space="preserve">: a successful registration must return only a created account, not an authenticated session — the frontend must route the user back to a real sign-in step (a genuine </w:t>
+      </w:r>
+      <w:r>
+        <w:rPr>
+          <w:rFonts w:ascii="Consolas" w:cs="Consolas" w:eastAsia="Consolas" w:hAnsi="Consolas"/>
+          <w:shd w:fill="EFEFEF" w:val="clear"/>
+        </w:rPr>
+        <w:t xml:space="preserve">POST /auth/login</w:t>
+      </w:r>
+      <w:r>
+        <w:t xml:space="preserve">) before any session/WebSocket is opened, so Module 5/6's risk check always sees the account's *true* first login from a clean history. This is now the implemented behavior (frontend-only fix — </w:t>
+      </w:r>
+      <w:r>
+        <w:rPr>
+          <w:rFonts w:ascii="Consolas" w:cs="Consolas" w:eastAsia="Consolas" w:hAnsi="Consolas"/>
+          <w:shd w:fill="EFEFEF" w:val="clear"/>
+        </w:rPr>
+        <w:t xml:space="preserve">POST /auth/register</w:t>
+      </w:r>
+      <w:r>
+        <w:t xml:space="preserve">'s own API contract is unchanged).</w:t>
       </w:r>
     </w:p>
     <w:p>

</xml_diff>

<commit_message>
Document confirmed SMTP delivery and the dev_code UI removal
Project status.md: extends section 14 with the SMTP_USERNAME typo found
via smtp_check.py (ztcaasm... vs ztsaacm...) and its fix, and records
delivery as confirmed working end-to-end. Adds section 15 documenting
the dev_code removal from Login.tsx (previous commit) now that SMTP
delivery is verified, including what was deliberately left unchanged on
the backend.

MASTER_PROJECT_CONTEXT.docx Section 7: updates the SMTP subsection to
"confirmed working", adds a dev_code-removal subsection, and updates the
finalized-spec table's Delivery row to reflect real Gmail SMTP as the
now-confirmed primary path rather than describing dev-logged as if it
were still the default.

Docs only -- no source files touched by this commit.

Co-Authored-By: Claude Sonnet 5 <noreply@anthropic.com>
Claude-Session: https://claude.ai/code/session_01EJVE4Sxiq9Efn6XjnuTBt9
</commit_message>
<xml_diff>
--- a/MASTER_PROJECT_CONTEXT.docx
+++ b/MASTER_PROJECT_CONTEXT.docx
@@ -2640,7 +2640,7 @@
         <w:spacing w:after="120" w:before="200"/>
       </w:pPr>
       <w:r>
-        <w:t xml:space="preserve">SMTP configured for real email delivery (2026-09-10)</w:t>
+        <w:t xml:space="preserve">SMTP configured for real email delivery — confirmed working (2026-09-10)</w:t>
       </w:r>
     </w:p>
     <w:p>
@@ -2725,7 +2725,67 @@
         <w:t xml:space="preserve">.env</w:t>
       </w:r>
       <w:r>
-        <w:t xml:space="preserve"> is gitignored and was not committed; the credentials never enter git history. As of this entry the developer has set the values but has not yet confirmed a live MEDIUM-risk login actually delivers an email — see </w:t>
+        <w:t xml:space="preserve"> is gitignored and was not committed; the credentials never enter git history. A standalone check, </w:t>
+      </w:r>
+      <w:r>
+        <w:rPr>
+          <w:rFonts w:ascii="Consolas" w:cs="Consolas" w:eastAsia="Consolas" w:hAnsi="Consolas"/>
+          <w:shd w:fill="EFEFEF" w:val="clear"/>
+        </w:rPr>
+        <w:t xml:space="preserve">backend/app/services/mfa/smtp_check.py</w:t>
+      </w:r>
+      <w:r>
+        <w:t xml:space="preserve"> (</w:t>
+      </w:r>
+      <w:r>
+        <w:rPr>
+          <w:rFonts w:ascii="Consolas" w:cs="Consolas" w:eastAsia="Consolas" w:hAnsi="Consolas"/>
+          <w:shd w:fill="EFEFEF" w:val="clear"/>
+        </w:rPr>
+        <w:t xml:space="preserve">python -m app.services.mfa.smtp_check &lt;email&gt;</w:t>
+      </w:r>
+      <w:r>
+        <w:t xml:space="preserve">), was added to verify SMTP with one command, entirely outside the login/MFA flow. Its first run caught a real bug — </w:t>
+      </w:r>
+      <w:r>
+        <w:rPr>
+          <w:rFonts w:ascii="Consolas" w:cs="Consolas" w:eastAsia="Consolas" w:hAnsi="Consolas"/>
+          <w:shd w:fill="EFEFEF" w:val="clear"/>
+        </w:rPr>
+        <w:t xml:space="preserve">SMTP_USERNAME</w:t>
+      </w:r>
+      <w:r>
+        <w:t xml:space="preserve"> had two letters transposed (</w:t>
+      </w:r>
+      <w:r>
+        <w:rPr>
+          <w:rFonts w:ascii="Consolas" w:cs="Consolas" w:eastAsia="Consolas" w:hAnsi="Consolas"/>
+          <w:shd w:fill="EFEFEF" w:val="clear"/>
+        </w:rPr>
+        <w:t xml:space="preserve">ztcaasm...</w:t>
+      </w:r>
+      <w:r>
+        <w:t xml:space="preserve"> instead of </w:t>
+      </w:r>
+      <w:r>
+        <w:rPr>
+          <w:rFonts w:ascii="Consolas" w:cs="Consolas" w:eastAsia="Consolas" w:hAnsi="Consolas"/>
+          <w:shd w:fill="EFEFEF" w:val="clear"/>
+        </w:rPr>
+        <w:t xml:space="preserve">ztsaacm...</w:t>
+      </w:r>
+      <w:r>
+        <w:t xml:space="preserve">), which Gmail correctly rejected with a </w:t>
+      </w:r>
+      <w:r>
+        <w:rPr>
+          <w:rFonts w:ascii="Consolas" w:cs="Consolas" w:eastAsia="Consolas" w:hAnsi="Consolas"/>
+          <w:shd w:fill="EFEFEF" w:val="clear"/>
+        </w:rPr>
+        <w:t xml:space="preserve">535</w:t>
+      </w:r>
+      <w:r>
+        <w:t xml:space="preserve"> auth error — not an App Password problem. After correcting the spelling, the check succeeded and the developer confirmed the code was received in the target inbox. Module 6's email-OTP delivery is now live end-to-end. See </w:t>
       </w:r>
       <w:r>
         <w:rPr>
@@ -2735,7 +2795,7 @@
         <w:t xml:space="preserve">Project status.md</w:t>
       </w:r>
       <w:r>
-        <w:t xml:space="preserve"> section 14. Per explicit instruction, the </w:t>
+        <w:t xml:space="preserve"> sections 14-15 for the full trace, including the </w:t>
       </w:r>
       <w:r>
         <w:rPr>
@@ -2745,17 +2805,94 @@
         <w:t xml:space="preserve">dev_code</w:t>
       </w:r>
       <w:r>
-        <w:t xml:space="preserve"> field in </w:t>
-      </w:r>
-      <w:r>
-        <w:rPr>
-          <w:rFonts w:ascii="Consolas" w:cs="Consolas" w:eastAsia="Consolas" w:hAnsi="Consolas"/>
-          <w:shd w:fill="EFEFEF" w:val="clear"/>
-        </w:rPr>
-        <w:t xml:space="preserve">Login.tsx</w:t>
-      </w:r>
-      <w:r>
-        <w:t xml:space="preserve">'s MFA step stays in place until that live delivery is confirmed, and will be removed as a separate, deliberate follow-up once confirmed — not bundled into the SMTP configuration change itself.</w:t>
+        <w:t xml:space="preserve"> UI removal this unblocked (below).</w:t>
+      </w:r>
+    </w:p>
+    <w:p>
+      <w:pPr>
+        <w:pStyle w:val="Heading2"/>
+        <w:spacing w:after="120" w:before="200"/>
+      </w:pPr>
+      <w:r>
+        <w:t xml:space="preserve">`dev_code` removed from the MFA screen (2026-09-10)</w:t>
+      </w:r>
+    </w:p>
+    <w:p>
+      <w:pPr>
+        <w:spacing w:after="160"/>
+      </w:pPr>
+      <w:r>
+        <w:t xml:space="preserve">With SMTP confirmed working, </w:t>
+      </w:r>
+      <w:r>
+        <w:rPr>
+          <w:rFonts w:ascii="Consolas" w:cs="Consolas" w:eastAsia="Consolas" w:hAnsi="Consolas"/>
+          <w:shd w:fill="EFEFEF" w:val="clear"/>
+        </w:rPr>
+        <w:t xml:space="preserve">frontend/src/pages/Login.tsx</w:t>
+      </w:r>
+      <w:r>
+        <w:t xml:space="preserve"> no longer displays </w:t>
+      </w:r>
+      <w:r>
+        <w:rPr>
+          <w:rFonts w:ascii="Consolas" w:cs="Consolas" w:eastAsia="Consolas" w:hAnsi="Consolas"/>
+          <w:shd w:fill="EFEFEF" w:val="clear"/>
+        </w:rPr>
+        <w:t xml:space="preserve">challenge.dev_code</w:t>
+      </w:r>
+      <w:r>
+        <w:t xml:space="preserve"> on the MFA verification step. This is UI-only: the backend's dev-logging fallback (</w:t>
+      </w:r>
+      <w:r>
+        <w:rPr>
+          <w:rFonts w:ascii="Consolas" w:cs="Consolas" w:eastAsia="Consolas" w:hAnsi="Consolas"/>
+          <w:shd w:fill="EFEFEF" w:val="clear"/>
+        </w:rPr>
+        <w:t xml:space="preserve">mfa/service.py</w:t>
+      </w:r>
+      <w:r>
+        <w:t xml:space="preserve">'s </w:t>
+      </w:r>
+      <w:r>
+        <w:rPr>
+          <w:rFonts w:ascii="Consolas" w:cs="Consolas" w:eastAsia="Consolas" w:hAnsi="Consolas"/>
+          <w:shd w:fill="EFEFEF" w:val="clear"/>
+        </w:rPr>
+        <w:t xml:space="preserve">_dev_exposed()</w:t>
+      </w:r>
+      <w:r>
+        <w:t xml:space="preserve">, </w:t>
+      </w:r>
+      <w:r>
+        <w:rPr>
+          <w:rFonts w:ascii="Consolas" w:cs="Consolas" w:eastAsia="Consolas" w:hAnsi="Consolas"/>
+          <w:shd w:fill="EFEFEF" w:val="clear"/>
+        </w:rPr>
+        <w:t xml:space="preserve">email_otp.py</w:t>
+      </w:r>
+      <w:r>
+        <w:t xml:space="preserve">'s dev-log path) and the </w:t>
+      </w:r>
+      <w:r>
+        <w:rPr>
+          <w:rFonts w:ascii="Consolas" w:cs="Consolas" w:eastAsia="Consolas" w:hAnsi="Consolas"/>
+          <w:shd w:fill="EFEFEF" w:val="clear"/>
+        </w:rPr>
+        <w:t xml:space="preserve">dev_code</w:t>
+      </w:r>
+      <w:r>
+        <w:t xml:space="preserve"> field on </w:t>
+      </w:r>
+      <w:r>
+        <w:rPr>
+          <w:rFonts w:ascii="Consolas" w:cs="Consolas" w:eastAsia="Consolas" w:hAnsi="Consolas"/>
+          <w:shd w:fill="EFEFEF" w:val="clear"/>
+        </w:rPr>
+        <w:t xml:space="preserve">MFAChallengeOut</w:t>
+      </w:r>
+      <w:r>
+        <w:t xml:space="preserve"> are untouched, so if SMTP is ever unconfigured again (a fresh local dev setup, CI, etc.) the backend still dev-logs the code and still returns it in the API response — the frontend simply no longer renders it. Module 6 is now feature-complete as designed: every MFA-required login gets a genuinely emailed one-time code, with no visible dev/test fallback in the UI.</w:t>
       </w:r>
     </w:p>
     <w:p>
@@ -3032,17 +3169,7 @@
               <w:spacing w:after="40"/>
             </w:pPr>
             <w:r>
-              <w:t xml:space="preserve">Real Gmail SMTP when configured; dev-logged + </w:t>
-            </w:r>
-            <w:r>
-              <w:rPr>
-                <w:rFonts w:ascii="Consolas" w:cs="Consolas" w:eastAsia="Consolas" w:hAnsi="Consolas"/>
-                <w:shd w:fill="EFEFEF" w:val="clear"/>
-              </w:rPr>
-              <w:t xml:space="preserve">dev_code</w:t>
-            </w:r>
-            <w:r>
-              <w:t xml:space="preserve"> in UI when SMTP is unconfigured</w:t>
+              <w:t xml:space="preserve">Real Gmail SMTP (confirmed working 2026-09-10); falls back to dev-logged server-side (no longer surfaced in the UI) if SMTP is ever unconfigured</w:t>
             </w:r>
           </w:p>
         </w:tc>

</xml_diff>

<commit_message>
Module 7 hardening: Real Passive Network Detection (Section 18)
</commit_message>
<xml_diff>
--- a/MASTER_PROJECT_CONTEXT.docx
+++ b/MASTER_PROJECT_CONTEXT.docx
@@ -4,8 +4,7 @@
   <w:body>
     <w:p>
       <w:pPr>
-        <w:pStyle w:val="Title"/>
-        <w:spacing w:after="300"/>
+        <w:spacing w:after="160"/>
       </w:pPr>
       <w:r>
         <w:t xml:space="preserve">MASTER PROJECT CONTEXT — ZERO TRUST SECURITY DASHBOARD</w:t>
@@ -91,7 +90,7 @@
           <w:ilvl w:val="0"/>
           <w:numId w:val="1"/>
         </w:numPr>
-        <w:spacing w:after="100"/>
+        <w:spacing w:after="120"/>
       </w:pPr>
       <w:r>
         <w:t xml:space="preserve">User authentication</w:t>
@@ -104,7 +103,7 @@
           <w:ilvl w:val="0"/>
           <w:numId w:val="1"/>
         </w:numPr>
-        <w:spacing w:after="100"/>
+        <w:spacing w:after="120"/>
       </w:pPr>
       <w:r>
         <w:t xml:space="preserve">Session lifecycle management</w:t>
@@ -117,7 +116,7 @@
           <w:ilvl w:val="0"/>
           <w:numId w:val="1"/>
         </w:numPr>
-        <w:spacing w:after="100"/>
+        <w:spacing w:after="120"/>
       </w:pPr>
       <w:r>
         <w:t xml:space="preserve">WebSocket-based session monitoring</w:t>
@@ -130,7 +129,7 @@
           <w:ilvl w:val="0"/>
           <w:numId w:val="1"/>
         </w:numPr>
-        <w:spacing w:after="100"/>
+        <w:spacing w:after="120"/>
       </w:pPr>
       <w:r>
         <w:t xml:space="preserve">Dynamic network ACL management</w:t>
@@ -143,7 +142,7 @@
           <w:ilvl w:val="0"/>
           <w:numId w:val="1"/>
         </w:numPr>
-        <w:spacing w:after="100"/>
+        <w:spacing w:after="120"/>
       </w:pPr>
       <w:r>
         <w:t xml:space="preserve">Trust Score</w:t>
@@ -156,7 +155,7 @@
           <w:ilvl w:val="0"/>
           <w:numId w:val="1"/>
         </w:numPr>
-        <w:spacing w:after="100"/>
+        <w:spacing w:after="120"/>
       </w:pPr>
       <w:r>
         <w:t xml:space="preserve">Adaptive MFA</w:t>
@@ -169,7 +168,7 @@
           <w:ilvl w:val="0"/>
           <w:numId w:val="1"/>
         </w:numPr>
-        <w:spacing w:after="100"/>
+        <w:spacing w:after="120"/>
       </w:pPr>
       <w:r>
         <w:t xml:space="preserve">Continuous Trust Evaluation</w:t>
@@ -182,7 +181,7 @@
           <w:ilvl w:val="0"/>
           <w:numId w:val="1"/>
         </w:numPr>
-        <w:spacing w:after="100"/>
+        <w:spacing w:after="120"/>
       </w:pPr>
       <w:r>
         <w:t xml:space="preserve">Security alerts</w:t>
@@ -195,7 +194,7 @@
           <w:ilvl w:val="0"/>
           <w:numId w:val="1"/>
         </w:numPr>
-        <w:spacing w:after="100"/>
+        <w:spacing w:after="120"/>
       </w:pPr>
       <w:r>
         <w:t xml:space="preserve">Real-time monitoring</w:t>
@@ -208,7 +207,7 @@
           <w:ilvl w:val="0"/>
           <w:numId w:val="1"/>
         </w:numPr>
-        <w:spacing w:after="100"/>
+        <w:spacing w:after="120"/>
       </w:pPr>
       <w:r>
         <w:t xml:space="preserve">Attack simulation</w:t>
@@ -221,7 +220,7 @@
           <w:ilvl w:val="0"/>
           <w:numId w:val="1"/>
         </w:numPr>
-        <w:spacing w:after="100"/>
+        <w:spacing w:after="120"/>
       </w:pPr>
       <w:r>
         <w:t xml:space="preserve">Analytics</w:t>
@@ -307,7 +306,7 @@
           <w:ilvl w:val="0"/>
           <w:numId w:val="1"/>
         </w:numPr>
-        <w:spacing w:after="100"/>
+        <w:spacing w:after="120"/>
       </w:pPr>
       <w:r>
         <w:t xml:space="preserve">Zero Trust principles</w:t>
@@ -320,7 +319,7 @@
           <w:ilvl w:val="0"/>
           <w:numId w:val="1"/>
         </w:numPr>
-        <w:spacing w:after="100"/>
+        <w:spacing w:after="120"/>
       </w:pPr>
       <w:r>
         <w:t xml:space="preserve">Agentless access control</w:t>
@@ -333,7 +332,7 @@
           <w:ilvl w:val="0"/>
           <w:numId w:val="1"/>
         </w:numPr>
-        <w:spacing w:after="100"/>
+        <w:spacing w:after="120"/>
       </w:pPr>
       <w:r>
         <w:t xml:space="preserve">JWT/authentication</w:t>
@@ -346,7 +345,7 @@
           <w:ilvl w:val="0"/>
           <w:numId w:val="1"/>
         </w:numPr>
-        <w:spacing w:after="100"/>
+        <w:spacing w:after="120"/>
       </w:pPr>
       <w:r>
         <w:t xml:space="preserve">Persistent WebSocket connection</w:t>
@@ -359,7 +358,7 @@
           <w:ilvl w:val="0"/>
           <w:numId w:val="1"/>
         </w:numPr>
-        <w:spacing w:after="100"/>
+        <w:spacing w:after="120"/>
       </w:pPr>
       <w:r>
         <w:t xml:space="preserve">Application-layer session lifecycle</w:t>
@@ -372,7 +371,7 @@
           <w:ilvl w:val="0"/>
           <w:numId w:val="1"/>
         </w:numPr>
-        <w:spacing w:after="100"/>
+        <w:spacing w:after="120"/>
       </w:pPr>
       <w:r>
         <w:t xml:space="preserve">Network-layer ACL</w:t>
@@ -385,7 +384,7 @@
           <w:ilvl w:val="0"/>
           <w:numId w:val="1"/>
         </w:numPr>
-        <w:spacing w:after="100"/>
+        <w:spacing w:after="120"/>
       </w:pPr>
       <w:r>
         <w:t xml:space="preserve">Automatic ACL creation</w:t>
@@ -398,7 +397,7 @@
           <w:ilvl w:val="0"/>
           <w:numId w:val="1"/>
         </w:numPr>
-        <w:spacing w:after="100"/>
+        <w:spacing w:after="120"/>
       </w:pPr>
       <w:r>
         <w:t xml:space="preserve">Automatic ACL removal</w:t>
@@ -411,7 +410,7 @@
           <w:ilvl w:val="0"/>
           <w:numId w:val="1"/>
         </w:numPr>
-        <w:spacing w:after="100"/>
+        <w:spacing w:after="120"/>
       </w:pPr>
       <w:r>
         <w:t xml:space="preserve">Containerized implementation</w:t>
@@ -424,7 +423,7 @@
           <w:ilvl w:val="0"/>
           <w:numId w:val="1"/>
         </w:numPr>
-        <w:spacing w:after="100"/>
+        <w:spacing w:after="120"/>
       </w:pPr>
       <w:r>
         <w:t xml:space="preserve">Infrastructure-as-Code principles</w:t>
@@ -660,7 +659,7 @@
     <w:p>
       <w:pPr>
         <w:pStyle w:val="Heading2"/>
-        <w:spacing w:after="120" w:before="200"/>
+        <w:spacing w:after="160" w:before="320"/>
       </w:pPr>
       <w:r>
         <w:t xml:space="preserve">A. User Portal</w:t>
@@ -681,7 +680,7 @@
           <w:ilvl w:val="0"/>
           <w:numId w:val="1"/>
         </w:numPr>
-        <w:spacing w:after="100"/>
+        <w:spacing w:after="120"/>
       </w:pPr>
       <w:r>
         <w:t xml:space="preserve">Login</w:t>
@@ -694,7 +693,7 @@
           <w:ilvl w:val="0"/>
           <w:numId w:val="1"/>
         </w:numPr>
-        <w:spacing w:after="100"/>
+        <w:spacing w:after="120"/>
       </w:pPr>
       <w:r>
         <w:t xml:space="preserve">Complete MFA when required</w:t>
@@ -707,7 +706,7 @@
           <w:ilvl w:val="0"/>
           <w:numId w:val="1"/>
         </w:numPr>
-        <w:spacing w:after="100"/>
+        <w:spacing w:after="120"/>
       </w:pPr>
       <w:r>
         <w:t xml:space="preserve">See current session status</w:t>
@@ -720,7 +719,7 @@
           <w:ilvl w:val="0"/>
           <w:numId w:val="1"/>
         </w:numPr>
-        <w:spacing w:after="100"/>
+        <w:spacing w:after="120"/>
       </w:pPr>
       <w:r>
         <w:t xml:space="preserve">See current trust score</w:t>
@@ -733,7 +732,7 @@
           <w:ilvl w:val="0"/>
           <w:numId w:val="1"/>
         </w:numPr>
-        <w:spacing w:after="100"/>
+        <w:spacing w:after="120"/>
       </w:pPr>
       <w:r>
         <w:t xml:space="preserve">Access protected resources</w:t>
@@ -746,7 +745,7 @@
           <w:ilvl w:val="0"/>
           <w:numId w:val="1"/>
         </w:numPr>
-        <w:spacing w:after="100"/>
+        <w:spacing w:after="120"/>
       </w:pPr>
       <w:r>
         <w:t xml:space="preserve">See whether access is granted/restricted/revoked</w:t>
@@ -759,7 +758,7 @@
           <w:ilvl w:val="0"/>
           <w:numId w:val="1"/>
         </w:numPr>
-        <w:spacing w:after="100"/>
+        <w:spacing w:after="120"/>
       </w:pPr>
       <w:r>
         <w:t xml:space="preserve">Logout</w:t>
@@ -768,7 +767,7 @@
     <w:p>
       <w:pPr>
         <w:pStyle w:val="Heading2"/>
-        <w:spacing w:after="120" w:before="200"/>
+        <w:spacing w:after="160" w:before="320"/>
       </w:pPr>
       <w:r>
         <w:t xml:space="preserve">B. Administrator Security Dashboard</w:t>
@@ -961,7 +960,7 @@
     <w:p>
       <w:pPr>
         <w:pStyle w:val="Heading2"/>
-        <w:spacing w:after="120" w:before="200"/>
+        <w:spacing w:after="160" w:before="320"/>
       </w:pPr>
       <w:r>
         <w:t xml:space="preserve">Finalized factor table</w:t>
@@ -969,7 +968,7 @@
     </w:p>
     <w:tbl>
       <w:tblPr>
-        <w:tblW w:type="dxa" w:w="9360"/>
+        <w:tblW w:type="dxa" w:w="9350"/>
         <w:tblBorders>
           <w:top w:val="single" w:color="auto" w:sz="4"/>
           <w:left w:val="single" w:color="auto" w:sz="4"/>
@@ -980,10 +979,10 @@
         </w:tblBorders>
       </w:tblPr>
       <w:tblGrid>
-        <w:gridCol w:w="2340"/>
-        <w:gridCol w:w="2340"/>
-        <w:gridCol w:w="2340"/>
-        <w:gridCol w:w="2340"/>
+        <w:gridCol w:w="2337"/>
+        <w:gridCol w:w="2337"/>
+        <w:gridCol w:w="2337"/>
+        <w:gridCol w:w="2337"/>
       </w:tblGrid>
       <w:tr>
         <w:trPr>
@@ -991,13 +990,16 @@
         </w:trPr>
         <w:tc>
           <w:tcPr>
-            <w:tcW w:type="dxa" w:w="2340"/>
-            <w:shd w:fill="D9E2F3" w:val="clear"/>
-          </w:tcPr>
-          <w:p>
-            <w:pPr>
-              <w:spacing w:after="40"/>
-            </w:pPr>
+            <w:tcW w:type="dxa" w:w="2337"/>
+            <w:shd w:fill="DDE6F2" w:val="clear"/>
+            <w:tcMar>
+              <w:top w:type="dxa" w:w="80"/>
+              <w:left w:type="dxa" w:w="100"/>
+              <w:bottom w:type="dxa" w:w="80"/>
+              <w:right w:type="dxa" w:w="100"/>
+            </w:tcMar>
+          </w:tcPr>
+          <w:p>
             <w:r>
               <w:rPr>
                 <w:b/>
@@ -1009,13 +1011,16 @@
         </w:tc>
         <w:tc>
           <w:tcPr>
-            <w:tcW w:type="dxa" w:w="2340"/>
-            <w:shd w:fill="D9E2F3" w:val="clear"/>
-          </w:tcPr>
-          <w:p>
-            <w:pPr>
-              <w:spacing w:after="40"/>
-            </w:pPr>
+            <w:tcW w:type="dxa" w:w="2337"/>
+            <w:shd w:fill="DDE6F2" w:val="clear"/>
+            <w:tcMar>
+              <w:top w:type="dxa" w:w="80"/>
+              <w:left w:type="dxa" w:w="100"/>
+              <w:bottom w:type="dxa" w:w="80"/>
+              <w:right w:type="dxa" w:w="100"/>
+            </w:tcMar>
+          </w:tcPr>
+          <w:p>
             <w:r>
               <w:rPr>
                 <w:b/>
@@ -1027,13 +1032,16 @@
         </w:tc>
         <w:tc>
           <w:tcPr>
-            <w:tcW w:type="dxa" w:w="2340"/>
-            <w:shd w:fill="D9E2F3" w:val="clear"/>
-          </w:tcPr>
-          <w:p>
-            <w:pPr>
-              <w:spacing w:after="40"/>
-            </w:pPr>
+            <w:tcW w:type="dxa" w:w="2337"/>
+            <w:shd w:fill="DDE6F2" w:val="clear"/>
+            <w:tcMar>
+              <w:top w:type="dxa" w:w="80"/>
+              <w:left w:type="dxa" w:w="100"/>
+              <w:bottom w:type="dxa" w:w="80"/>
+              <w:right w:type="dxa" w:w="100"/>
+            </w:tcMar>
+          </w:tcPr>
+          <w:p>
             <w:r>
               <w:rPr>
                 <w:b/>
@@ -1045,13 +1053,16 @@
         </w:tc>
         <w:tc>
           <w:tcPr>
-            <w:tcW w:type="dxa" w:w="2340"/>
-            <w:shd w:fill="D9E2F3" w:val="clear"/>
-          </w:tcPr>
-          <w:p>
-            <w:pPr>
-              <w:spacing w:after="40"/>
-            </w:pPr>
+            <w:tcW w:type="dxa" w:w="2337"/>
+            <w:shd w:fill="DDE6F2" w:val="clear"/>
+            <w:tcMar>
+              <w:top w:type="dxa" w:w="80"/>
+              <w:left w:type="dxa" w:w="100"/>
+              <w:bottom w:type="dxa" w:w="80"/>
+              <w:right w:type="dxa" w:w="100"/>
+            </w:tcMar>
+          </w:tcPr>
+          <w:p>
             <w:r>
               <w:rPr>
                 <w:b/>
@@ -1068,12 +1079,15 @@
         </w:trPr>
         <w:tc>
           <w:tcPr>
-            <w:tcW w:type="dxa" w:w="2340"/>
-          </w:tcPr>
-          <w:p>
-            <w:pPr>
-              <w:spacing w:after="40"/>
-            </w:pPr>
+            <w:tcW w:type="dxa" w:w="2337"/>
+            <w:tcMar>
+              <w:top w:type="dxa" w:w="80"/>
+              <w:left w:type="dxa" w:w="100"/>
+              <w:bottom w:type="dxa" w:w="80"/>
+              <w:right w:type="dxa" w:w="100"/>
+            </w:tcMar>
+          </w:tcPr>
+          <w:p>
             <w:r>
               <w:t xml:space="preserve">Baseline</w:t>
             </w:r>
@@ -1081,12 +1095,15 @@
         </w:tc>
         <w:tc>
           <w:tcPr>
-            <w:tcW w:type="dxa" w:w="2340"/>
-          </w:tcPr>
-          <w:p>
-            <w:pPr>
-              <w:spacing w:after="40"/>
-            </w:pPr>
+            <w:tcW w:type="dxa" w:w="2337"/>
+            <w:tcMar>
+              <w:top w:type="dxa" w:w="80"/>
+              <w:left w:type="dxa" w:w="100"/>
+              <w:bottom w:type="dxa" w:w="80"/>
+              <w:right w:type="dxa" w:w="100"/>
+            </w:tcMar>
+          </w:tcPr>
+          <w:p>
             <w:r>
               <w:t xml:space="preserve">—</w:t>
             </w:r>
@@ -1094,12 +1111,15 @@
         </w:tc>
         <w:tc>
           <w:tcPr>
-            <w:tcW w:type="dxa" w:w="2340"/>
-          </w:tcPr>
-          <w:p>
-            <w:pPr>
-              <w:spacing w:after="40"/>
-            </w:pPr>
+            <w:tcW w:type="dxa" w:w="2337"/>
+            <w:tcMar>
+              <w:top w:type="dxa" w:w="80"/>
+              <w:left w:type="dxa" w:w="100"/>
+              <w:bottom w:type="dxa" w:w="80"/>
+              <w:right w:type="dxa" w:w="100"/>
+            </w:tcMar>
+          </w:tcPr>
+          <w:p>
             <w:r>
               <w:t xml:space="preserve">70</w:t>
             </w:r>
@@ -1107,12 +1127,15 @@
         </w:tc>
         <w:tc>
           <w:tcPr>
-            <w:tcW w:type="dxa" w:w="2340"/>
-          </w:tcPr>
-          <w:p>
-            <w:pPr>
-              <w:spacing w:after="40"/>
-            </w:pPr>
+            <w:tcW w:type="dxa" w:w="2337"/>
+            <w:tcMar>
+              <w:top w:type="dxa" w:w="80"/>
+              <w:left w:type="dxa" w:w="100"/>
+              <w:bottom w:type="dxa" w:w="80"/>
+              <w:right w:type="dxa" w:w="100"/>
+            </w:tcMar>
+          </w:tcPr>
+          <w:p>
             <w:r>
               <w:t xml:space="preserve">Always</w:t>
             </w:r>
@@ -1125,12 +1148,15 @@
         </w:trPr>
         <w:tc>
           <w:tcPr>
-            <w:tcW w:type="dxa" w:w="2340"/>
-          </w:tcPr>
-          <w:p>
-            <w:pPr>
-              <w:spacing w:after="40"/>
-            </w:pPr>
+            <w:tcW w:type="dxa" w:w="2337"/>
+            <w:tcMar>
+              <w:top w:type="dxa" w:w="80"/>
+              <w:left w:type="dxa" w:w="100"/>
+              <w:bottom w:type="dxa" w:w="80"/>
+              <w:right w:type="dxa" w:w="100"/>
+            </w:tcMar>
+          </w:tcPr>
+          <w:p>
             <w:r>
               <w:t xml:space="preserve">Known device (User-Agent seen before for this user)</w:t>
             </w:r>
@@ -1138,12 +1164,15 @@
         </w:tc>
         <w:tc>
           <w:tcPr>
-            <w:tcW w:type="dxa" w:w="2340"/>
-          </w:tcPr>
-          <w:p>
-            <w:pPr>
-              <w:spacing w:after="40"/>
-            </w:pPr>
+            <w:tcW w:type="dxa" w:w="2337"/>
+            <w:tcMar>
+              <w:top w:type="dxa" w:w="80"/>
+              <w:left w:type="dxa" w:w="100"/>
+              <w:bottom w:type="dxa" w:w="80"/>
+              <w:right w:type="dxa" w:w="100"/>
+            </w:tcMar>
+          </w:tcPr>
+          <w:p>
             <w:r>
               <w:t xml:space="preserve">Positive</w:t>
             </w:r>
@@ -1151,12 +1180,15 @@
         </w:tc>
         <w:tc>
           <w:tcPr>
-            <w:tcW w:type="dxa" w:w="2340"/>
-          </w:tcPr>
-          <w:p>
-            <w:pPr>
-              <w:spacing w:after="40"/>
-            </w:pPr>
+            <w:tcW w:type="dxa" w:w="2337"/>
+            <w:tcMar>
+              <w:top w:type="dxa" w:w="80"/>
+              <w:left w:type="dxa" w:w="100"/>
+              <w:bottom w:type="dxa" w:w="80"/>
+              <w:right w:type="dxa" w:w="100"/>
+            </w:tcMar>
+          </w:tcPr>
+          <w:p>
             <w:r>
               <w:t xml:space="preserve">+15</w:t>
             </w:r>
@@ -1164,12 +1196,15 @@
         </w:tc>
         <w:tc>
           <w:tcPr>
-            <w:tcW w:type="dxa" w:w="2340"/>
-          </w:tcPr>
-          <w:p>
-            <w:pPr>
-              <w:spacing w:after="40"/>
-            </w:pPr>
+            <w:tcW w:type="dxa" w:w="2337"/>
+            <w:tcMar>
+              <w:top w:type="dxa" w:w="80"/>
+              <w:left w:type="dxa" w:w="100"/>
+              <w:bottom w:type="dxa" w:w="80"/>
+              <w:right w:type="dxa" w:w="100"/>
+            </w:tcMar>
+          </w:tcPr>
+          <w:p>
             <w:r>
               <w:t xml:space="preserve">User has prior session history</w:t>
             </w:r>
@@ -1182,12 +1217,15 @@
         </w:trPr>
         <w:tc>
           <w:tcPr>
-            <w:tcW w:type="dxa" w:w="2340"/>
-          </w:tcPr>
-          <w:p>
-            <w:pPr>
-              <w:spacing w:after="40"/>
-            </w:pPr>
+            <w:tcW w:type="dxa" w:w="2337"/>
+            <w:tcMar>
+              <w:top w:type="dxa" w:w="80"/>
+              <w:left w:type="dxa" w:w="100"/>
+              <w:bottom w:type="dxa" w:w="80"/>
+              <w:right w:type="dxa" w:w="100"/>
+            </w:tcMar>
+          </w:tcPr>
+          <w:p>
             <w:r>
               <w:t xml:space="preserve">Known IP / same subnet as recent sessions</w:t>
             </w:r>
@@ -1195,12 +1233,15 @@
         </w:tc>
         <w:tc>
           <w:tcPr>
-            <w:tcW w:type="dxa" w:w="2340"/>
-          </w:tcPr>
-          <w:p>
-            <w:pPr>
-              <w:spacing w:after="40"/>
-            </w:pPr>
+            <w:tcW w:type="dxa" w:w="2337"/>
+            <w:tcMar>
+              <w:top w:type="dxa" w:w="80"/>
+              <w:left w:type="dxa" w:w="100"/>
+              <w:bottom w:type="dxa" w:w="80"/>
+              <w:right w:type="dxa" w:w="100"/>
+            </w:tcMar>
+          </w:tcPr>
+          <w:p>
             <w:r>
               <w:t xml:space="preserve">Positive</w:t>
             </w:r>
@@ -1208,12 +1249,15 @@
         </w:tc>
         <w:tc>
           <w:tcPr>
-            <w:tcW w:type="dxa" w:w="2340"/>
-          </w:tcPr>
-          <w:p>
-            <w:pPr>
-              <w:spacing w:after="40"/>
-            </w:pPr>
+            <w:tcW w:type="dxa" w:w="2337"/>
+            <w:tcMar>
+              <w:top w:type="dxa" w:w="80"/>
+              <w:left w:type="dxa" w:w="100"/>
+              <w:bottom w:type="dxa" w:w="80"/>
+              <w:right w:type="dxa" w:w="100"/>
+            </w:tcMar>
+          </w:tcPr>
+          <w:p>
             <w:r>
               <w:t xml:space="preserve">+10</w:t>
             </w:r>
@@ -1221,12 +1265,15 @@
         </w:tc>
         <w:tc>
           <w:tcPr>
-            <w:tcW w:type="dxa" w:w="2340"/>
-          </w:tcPr>
-          <w:p>
-            <w:pPr>
-              <w:spacing w:after="40"/>
-            </w:pPr>
+            <w:tcW w:type="dxa" w:w="2337"/>
+            <w:tcMar>
+              <w:top w:type="dxa" w:w="80"/>
+              <w:left w:type="dxa" w:w="100"/>
+              <w:bottom w:type="dxa" w:w="80"/>
+              <w:right w:type="dxa" w:w="100"/>
+            </w:tcMar>
+          </w:tcPr>
+          <w:p>
             <w:r>
               <w:t xml:space="preserve">User has prior session history</w:t>
             </w:r>
@@ -1239,12 +1286,15 @@
         </w:trPr>
         <w:tc>
           <w:tcPr>
-            <w:tcW w:type="dxa" w:w="2340"/>
-          </w:tcPr>
-          <w:p>
-            <w:pPr>
-              <w:spacing w:after="40"/>
-            </w:pPr>
+            <w:tcW w:type="dxa" w:w="2337"/>
+            <w:tcMar>
+              <w:top w:type="dxa" w:w="80"/>
+              <w:left w:type="dxa" w:w="100"/>
+              <w:bottom w:type="dxa" w:w="80"/>
+              <w:right w:type="dxa" w:w="100"/>
+            </w:tcMar>
+          </w:tcPr>
+          <w:p>
             <w:r>
               <w:t xml:space="preserve">Login within user's typical hour range</w:t>
             </w:r>
@@ -1252,12 +1302,15 @@
         </w:tc>
         <w:tc>
           <w:tcPr>
-            <w:tcW w:type="dxa" w:w="2340"/>
-          </w:tcPr>
-          <w:p>
-            <w:pPr>
-              <w:spacing w:after="40"/>
-            </w:pPr>
+            <w:tcW w:type="dxa" w:w="2337"/>
+            <w:tcMar>
+              <w:top w:type="dxa" w:w="80"/>
+              <w:left w:type="dxa" w:w="100"/>
+              <w:bottom w:type="dxa" w:w="80"/>
+              <w:right w:type="dxa" w:w="100"/>
+            </w:tcMar>
+          </w:tcPr>
+          <w:p>
             <w:r>
               <w:t xml:space="preserve">Positive</w:t>
             </w:r>
@@ -1265,12 +1318,15 @@
         </w:tc>
         <w:tc>
           <w:tcPr>
-            <w:tcW w:type="dxa" w:w="2340"/>
-          </w:tcPr>
-          <w:p>
-            <w:pPr>
-              <w:spacing w:after="40"/>
-            </w:pPr>
+            <w:tcW w:type="dxa" w:w="2337"/>
+            <w:tcMar>
+              <w:top w:type="dxa" w:w="80"/>
+              <w:left w:type="dxa" w:w="100"/>
+              <w:bottom w:type="dxa" w:w="80"/>
+              <w:right w:type="dxa" w:w="100"/>
+            </w:tcMar>
+          </w:tcPr>
+          <w:p>
             <w:r>
               <w:t xml:space="preserve">+5</w:t>
             </w:r>
@@ -1278,12 +1334,15 @@
         </w:tc>
         <w:tc>
           <w:tcPr>
-            <w:tcW w:type="dxa" w:w="2340"/>
-          </w:tcPr>
-          <w:p>
-            <w:pPr>
-              <w:spacing w:after="40"/>
-            </w:pPr>
+            <w:tcW w:type="dxa" w:w="2337"/>
+            <w:tcMar>
+              <w:top w:type="dxa" w:w="80"/>
+              <w:left w:type="dxa" w:w="100"/>
+              <w:bottom w:type="dxa" w:w="80"/>
+              <w:right w:type="dxa" w:w="100"/>
+            </w:tcMar>
+          </w:tcPr>
+          <w:p>
             <w:r>
               <w:t xml:space="preserve">User has ≥5 prior sessions</w:t>
             </w:r>
@@ -1296,12 +1355,15 @@
         </w:trPr>
         <w:tc>
           <w:tcPr>
-            <w:tcW w:type="dxa" w:w="2340"/>
-          </w:tcPr>
-          <w:p>
-            <w:pPr>
-              <w:spacing w:after="40"/>
-            </w:pPr>
+            <w:tcW w:type="dxa" w:w="2337"/>
+            <w:tcMar>
+              <w:top w:type="dxa" w:w="80"/>
+              <w:left w:type="dxa" w:w="100"/>
+              <w:bottom w:type="dxa" w:w="80"/>
+              <w:right w:type="dxa" w:w="100"/>
+            </w:tcMar>
+          </w:tcPr>
+          <w:p>
             <w:r>
               <w:t xml:space="preserve">Unknown/new device</w:t>
             </w:r>
@@ -1309,12 +1371,15 @@
         </w:tc>
         <w:tc>
           <w:tcPr>
-            <w:tcW w:type="dxa" w:w="2340"/>
-          </w:tcPr>
-          <w:p>
-            <w:pPr>
-              <w:spacing w:after="40"/>
-            </w:pPr>
+            <w:tcW w:type="dxa" w:w="2337"/>
+            <w:tcMar>
+              <w:top w:type="dxa" w:w="80"/>
+              <w:left w:type="dxa" w:w="100"/>
+              <w:bottom w:type="dxa" w:w="80"/>
+              <w:right w:type="dxa" w:w="100"/>
+            </w:tcMar>
+          </w:tcPr>
+          <w:p>
             <w:r>
               <w:t xml:space="preserve">Negative</w:t>
             </w:r>
@@ -1322,12 +1387,15 @@
         </w:tc>
         <w:tc>
           <w:tcPr>
-            <w:tcW w:type="dxa" w:w="2340"/>
-          </w:tcPr>
-          <w:p>
-            <w:pPr>
-              <w:spacing w:after="40"/>
-            </w:pPr>
+            <w:tcW w:type="dxa" w:w="2337"/>
+            <w:tcMar>
+              <w:top w:type="dxa" w:w="80"/>
+              <w:left w:type="dxa" w:w="100"/>
+              <w:bottom w:type="dxa" w:w="80"/>
+              <w:right w:type="dxa" w:w="100"/>
+            </w:tcMar>
+          </w:tcPr>
+          <w:p>
             <w:r>
               <w:t xml:space="preserve">−10</w:t>
             </w:r>
@@ -1335,12 +1403,15 @@
         </w:tc>
         <w:tc>
           <w:tcPr>
-            <w:tcW w:type="dxa" w:w="2340"/>
-          </w:tcPr>
-          <w:p>
-            <w:pPr>
-              <w:spacing w:after="40"/>
-            </w:pPr>
+            <w:tcW w:type="dxa" w:w="2337"/>
+            <w:tcMar>
+              <w:top w:type="dxa" w:w="80"/>
+              <w:left w:type="dxa" w:w="100"/>
+              <w:bottom w:type="dxa" w:w="80"/>
+              <w:right w:type="dxa" w:w="100"/>
+            </w:tcMar>
+          </w:tcPr>
+          <w:p>
             <w:r>
               <w:t xml:space="preserve">User has prior session history</w:t>
             </w:r>
@@ -1353,12 +1424,15 @@
         </w:trPr>
         <w:tc>
           <w:tcPr>
-            <w:tcW w:type="dxa" w:w="2340"/>
-          </w:tcPr>
-          <w:p>
-            <w:pPr>
-              <w:spacing w:after="40"/>
-            </w:pPr>
+            <w:tcW w:type="dxa" w:w="2337"/>
+            <w:tcMar>
+              <w:top w:type="dxa" w:w="80"/>
+              <w:left w:type="dxa" w:w="100"/>
+              <w:bottom w:type="dxa" w:w="80"/>
+              <w:right w:type="dxa" w:w="100"/>
+            </w:tcMar>
+          </w:tcPr>
+          <w:p>
             <w:r>
               <w:t xml:space="preserve">IP changed from last session</w:t>
             </w:r>
@@ -1366,12 +1440,15 @@
         </w:tc>
         <w:tc>
           <w:tcPr>
-            <w:tcW w:type="dxa" w:w="2340"/>
-          </w:tcPr>
-          <w:p>
-            <w:pPr>
-              <w:spacing w:after="40"/>
-            </w:pPr>
+            <w:tcW w:type="dxa" w:w="2337"/>
+            <w:tcMar>
+              <w:top w:type="dxa" w:w="80"/>
+              <w:left w:type="dxa" w:w="100"/>
+              <w:bottom w:type="dxa" w:w="80"/>
+              <w:right w:type="dxa" w:w="100"/>
+            </w:tcMar>
+          </w:tcPr>
+          <w:p>
             <w:r>
               <w:t xml:space="preserve">Negative</w:t>
             </w:r>
@@ -1379,12 +1456,15 @@
         </w:tc>
         <w:tc>
           <w:tcPr>
-            <w:tcW w:type="dxa" w:w="2340"/>
-          </w:tcPr>
-          <w:p>
-            <w:pPr>
-              <w:spacing w:after="40"/>
-            </w:pPr>
+            <w:tcW w:type="dxa" w:w="2337"/>
+            <w:tcMar>
+              <w:top w:type="dxa" w:w="80"/>
+              <w:left w:type="dxa" w:w="100"/>
+              <w:bottom w:type="dxa" w:w="80"/>
+              <w:right w:type="dxa" w:w="100"/>
+            </w:tcMar>
+          </w:tcPr>
+          <w:p>
             <w:r>
               <w:t xml:space="preserve">−10</w:t>
             </w:r>
@@ -1392,12 +1472,15 @@
         </w:tc>
         <w:tc>
           <w:tcPr>
-            <w:tcW w:type="dxa" w:w="2340"/>
-          </w:tcPr>
-          <w:p>
-            <w:pPr>
-              <w:spacing w:after="40"/>
-            </w:pPr>
+            <w:tcW w:type="dxa" w:w="2337"/>
+            <w:tcMar>
+              <w:top w:type="dxa" w:w="80"/>
+              <w:left w:type="dxa" w:w="100"/>
+              <w:bottom w:type="dxa" w:w="80"/>
+              <w:right w:type="dxa" w:w="100"/>
+            </w:tcMar>
+          </w:tcPr>
+          <w:p>
             <w:r>
               <w:t xml:space="preserve">User has prior session history</w:t>
             </w:r>
@@ -1410,12 +1493,15 @@
         </w:trPr>
         <w:tc>
           <w:tcPr>
-            <w:tcW w:type="dxa" w:w="2340"/>
-          </w:tcPr>
-          <w:p>
-            <w:pPr>
-              <w:spacing w:after="40"/>
-            </w:pPr>
+            <w:tcW w:type="dxa" w:w="2337"/>
+            <w:tcMar>
+              <w:top w:type="dxa" w:w="80"/>
+              <w:left w:type="dxa" w:w="100"/>
+              <w:bottom w:type="dxa" w:w="80"/>
+              <w:right w:type="dxa" w:w="100"/>
+            </w:tcMar>
+          </w:tcPr>
+          <w:p>
             <w:r>
               <w:t xml:space="preserve">Approved VPN range (organization's known/allowed VPN CIDRs)</w:t>
             </w:r>
@@ -1423,12 +1509,15 @@
         </w:tc>
         <w:tc>
           <w:tcPr>
-            <w:tcW w:type="dxa" w:w="2340"/>
-          </w:tcPr>
-          <w:p>
-            <w:pPr>
-              <w:spacing w:after="40"/>
-            </w:pPr>
+            <w:tcW w:type="dxa" w:w="2337"/>
+            <w:tcMar>
+              <w:top w:type="dxa" w:w="80"/>
+              <w:left w:type="dxa" w:w="100"/>
+              <w:bottom w:type="dxa" w:w="80"/>
+              <w:right w:type="dxa" w:w="100"/>
+            </w:tcMar>
+          </w:tcPr>
+          <w:p>
             <w:r>
               <w:t xml:space="preserve">Positive</w:t>
             </w:r>
@@ -1436,12 +1525,15 @@
         </w:tc>
         <w:tc>
           <w:tcPr>
-            <w:tcW w:type="dxa" w:w="2340"/>
-          </w:tcPr>
-          <w:p>
-            <w:pPr>
-              <w:spacing w:after="40"/>
-            </w:pPr>
+            <w:tcW w:type="dxa" w:w="2337"/>
+            <w:tcMar>
+              <w:top w:type="dxa" w:w="80"/>
+              <w:left w:type="dxa" w:w="100"/>
+              <w:bottom w:type="dxa" w:w="80"/>
+              <w:right w:type="dxa" w:w="100"/>
+            </w:tcMar>
+          </w:tcPr>
+          <w:p>
             <w:r>
               <w:t xml:space="preserve">+10</w:t>
             </w:r>
@@ -1449,12 +1541,15 @@
         </w:tc>
         <w:tc>
           <w:tcPr>
-            <w:tcW w:type="dxa" w:w="2340"/>
-          </w:tcPr>
-          <w:p>
-            <w:pPr>
-              <w:spacing w:after="40"/>
-            </w:pPr>
+            <w:tcW w:type="dxa" w:w="2337"/>
+            <w:tcMar>
+              <w:top w:type="dxa" w:w="80"/>
+              <w:left w:type="dxa" w:w="100"/>
+              <w:bottom w:type="dxa" w:w="80"/>
+              <w:right w:type="dxa" w:w="100"/>
+            </w:tcMar>
+          </w:tcPr>
+          <w:p>
             <w:r>
               <w:t xml:space="preserve">Always checked</w:t>
             </w:r>
@@ -1467,12 +1562,15 @@
         </w:trPr>
         <w:tc>
           <w:tcPr>
-            <w:tcW w:type="dxa" w:w="2340"/>
-          </w:tcPr>
-          <w:p>
-            <w:pPr>
-              <w:spacing w:after="40"/>
-            </w:pPr>
+            <w:tcW w:type="dxa" w:w="2337"/>
+            <w:tcMar>
+              <w:top w:type="dxa" w:w="80"/>
+              <w:left w:type="dxa" w:w="100"/>
+              <w:bottom w:type="dxa" w:w="80"/>
+              <w:right w:type="dxa" w:w="100"/>
+            </w:tcMar>
+          </w:tcPr>
+          <w:p>
             <w:r>
               <w:t xml:space="preserve">Unknown/public VPN or proxy range (not organization-approved)</w:t>
             </w:r>
@@ -1480,12 +1578,15 @@
         </w:tc>
         <w:tc>
           <w:tcPr>
-            <w:tcW w:type="dxa" w:w="2340"/>
-          </w:tcPr>
-          <w:p>
-            <w:pPr>
-              <w:spacing w:after="40"/>
-            </w:pPr>
+            <w:tcW w:type="dxa" w:w="2337"/>
+            <w:tcMar>
+              <w:top w:type="dxa" w:w="80"/>
+              <w:left w:type="dxa" w:w="100"/>
+              <w:bottom w:type="dxa" w:w="80"/>
+              <w:right w:type="dxa" w:w="100"/>
+            </w:tcMar>
+          </w:tcPr>
+          <w:p>
             <w:r>
               <w:t xml:space="preserve">Negative</w:t>
             </w:r>
@@ -1493,12 +1594,15 @@
         </w:tc>
         <w:tc>
           <w:tcPr>
-            <w:tcW w:type="dxa" w:w="2340"/>
-          </w:tcPr>
-          <w:p>
-            <w:pPr>
-              <w:spacing w:after="40"/>
-            </w:pPr>
+            <w:tcW w:type="dxa" w:w="2337"/>
+            <w:tcMar>
+              <w:top w:type="dxa" w:w="80"/>
+              <w:left w:type="dxa" w:w="100"/>
+              <w:bottom w:type="dxa" w:w="80"/>
+              <w:right w:type="dxa" w:w="100"/>
+            </w:tcMar>
+          </w:tcPr>
+          <w:p>
             <w:r>
               <w:t xml:space="preserve">−15</w:t>
             </w:r>
@@ -1506,12 +1610,15 @@
         </w:tc>
         <w:tc>
           <w:tcPr>
-            <w:tcW w:type="dxa" w:w="2340"/>
-          </w:tcPr>
-          <w:p>
-            <w:pPr>
-              <w:spacing w:after="40"/>
-            </w:pPr>
+            <w:tcW w:type="dxa" w:w="2337"/>
+            <w:tcMar>
+              <w:top w:type="dxa" w:w="80"/>
+              <w:left w:type="dxa" w:w="100"/>
+              <w:bottom w:type="dxa" w:w="80"/>
+              <w:right w:type="dxa" w:w="100"/>
+            </w:tcMar>
+          </w:tcPr>
+          <w:p>
             <w:r>
               <w:t xml:space="preserve">Always checked</w:t>
             </w:r>
@@ -1524,12 +1631,15 @@
         </w:trPr>
         <w:tc>
           <w:tcPr>
-            <w:tcW w:type="dxa" w:w="2340"/>
-          </w:tcPr>
-          <w:p>
-            <w:pPr>
-              <w:spacing w:after="40"/>
-            </w:pPr>
+            <w:tcW w:type="dxa" w:w="2337"/>
+            <w:tcMar>
+              <w:top w:type="dxa" w:w="80"/>
+              <w:left w:type="dxa" w:w="100"/>
+              <w:bottom w:type="dxa" w:w="80"/>
+              <w:right w:type="dxa" w:w="100"/>
+            </w:tcMar>
+          </w:tcPr>
+          <w:p>
             <w:r>
               <w:t xml:space="preserve">≥3 failed login attempts in the preceding 15 minutes</w:t>
             </w:r>
@@ -1537,12 +1647,15 @@
         </w:tc>
         <w:tc>
           <w:tcPr>
-            <w:tcW w:type="dxa" w:w="2340"/>
-          </w:tcPr>
-          <w:p>
-            <w:pPr>
-              <w:spacing w:after="40"/>
-            </w:pPr>
+            <w:tcW w:type="dxa" w:w="2337"/>
+            <w:tcMar>
+              <w:top w:type="dxa" w:w="80"/>
+              <w:left w:type="dxa" w:w="100"/>
+              <w:bottom w:type="dxa" w:w="80"/>
+              <w:right w:type="dxa" w:w="100"/>
+            </w:tcMar>
+          </w:tcPr>
+          <w:p>
             <w:r>
               <w:t xml:space="preserve">Negative</w:t>
             </w:r>
@@ -1550,12 +1663,15 @@
         </w:tc>
         <w:tc>
           <w:tcPr>
-            <w:tcW w:type="dxa" w:w="2340"/>
-          </w:tcPr>
-          <w:p>
-            <w:pPr>
-              <w:spacing w:after="40"/>
-            </w:pPr>
+            <w:tcW w:type="dxa" w:w="2337"/>
+            <w:tcMar>
+              <w:top w:type="dxa" w:w="80"/>
+              <w:left w:type="dxa" w:w="100"/>
+              <w:bottom w:type="dxa" w:w="80"/>
+              <w:right w:type="dxa" w:w="100"/>
+            </w:tcMar>
+          </w:tcPr>
+          <w:p>
             <w:r>
               <w:t xml:space="preserve">−15</w:t>
             </w:r>
@@ -1563,12 +1679,15 @@
         </w:tc>
         <w:tc>
           <w:tcPr>
-            <w:tcW w:type="dxa" w:w="2340"/>
-          </w:tcPr>
-          <w:p>
-            <w:pPr>
-              <w:spacing w:after="40"/>
-            </w:pPr>
+            <w:tcW w:type="dxa" w:w="2337"/>
+            <w:tcMar>
+              <w:top w:type="dxa" w:w="80"/>
+              <w:left w:type="dxa" w:w="100"/>
+              <w:bottom w:type="dxa" w:w="80"/>
+              <w:right w:type="dxa" w:w="100"/>
+            </w:tcMar>
+          </w:tcPr>
+          <w:p>
             <w:r>
               <w:t xml:space="preserve">Always checked (Redis-backed counter)</w:t>
             </w:r>
@@ -1581,12 +1700,15 @@
         </w:trPr>
         <w:tc>
           <w:tcPr>
-            <w:tcW w:type="dxa" w:w="2340"/>
-          </w:tcPr>
-          <w:p>
-            <w:pPr>
-              <w:spacing w:after="40"/>
-            </w:pPr>
+            <w:tcW w:type="dxa" w:w="2337"/>
+            <w:tcMar>
+              <w:top w:type="dxa" w:w="80"/>
+              <w:left w:type="dxa" w:w="100"/>
+              <w:bottom w:type="dxa" w:w="80"/>
+              <w:right w:type="dxa" w:w="100"/>
+            </w:tcMar>
+          </w:tcPr>
+          <w:p>
             <w:r>
               <w:t xml:space="preserve">Off-hours login (12am–5am), fallback only</w:t>
             </w:r>
@@ -1594,12 +1716,15 @@
         </w:tc>
         <w:tc>
           <w:tcPr>
-            <w:tcW w:type="dxa" w:w="2340"/>
-          </w:tcPr>
-          <w:p>
-            <w:pPr>
-              <w:spacing w:after="40"/>
-            </w:pPr>
+            <w:tcW w:type="dxa" w:w="2337"/>
+            <w:tcMar>
+              <w:top w:type="dxa" w:w="80"/>
+              <w:left w:type="dxa" w:w="100"/>
+              <w:bottom w:type="dxa" w:w="80"/>
+              <w:right w:type="dxa" w:w="100"/>
+            </w:tcMar>
+          </w:tcPr>
+          <w:p>
             <w:r>
               <w:t xml:space="preserve">Negative</w:t>
             </w:r>
@@ -1607,12 +1732,15 @@
         </w:tc>
         <w:tc>
           <w:tcPr>
-            <w:tcW w:type="dxa" w:w="2340"/>
-          </w:tcPr>
-          <w:p>
-            <w:pPr>
-              <w:spacing w:after="40"/>
-            </w:pPr>
+            <w:tcW w:type="dxa" w:w="2337"/>
+            <w:tcMar>
+              <w:top w:type="dxa" w:w="80"/>
+              <w:left w:type="dxa" w:w="100"/>
+              <w:bottom w:type="dxa" w:w="80"/>
+              <w:right w:type="dxa" w:w="100"/>
+            </w:tcMar>
+          </w:tcPr>
+          <w:p>
             <w:r>
               <w:t xml:space="preserve">−5</w:t>
             </w:r>
@@ -1620,12 +1748,15 @@
         </w:tc>
         <w:tc>
           <w:tcPr>
-            <w:tcW w:type="dxa" w:w="2340"/>
-          </w:tcPr>
-          <w:p>
-            <w:pPr>
-              <w:spacing w:after="40"/>
-            </w:pPr>
+            <w:tcW w:type="dxa" w:w="2337"/>
+            <w:tcMar>
+              <w:top w:type="dxa" w:w="80"/>
+              <w:left w:type="dxa" w:w="100"/>
+              <w:bottom w:type="dxa" w:w="80"/>
+              <w:right w:type="dxa" w:w="100"/>
+            </w:tcMar>
+          </w:tcPr>
+          <w:p>
             <w:r>
               <w:t xml:space="preserve">Used only when no personal history exists yet (i.e., the "typical hour" factor above cannot run)</w:t>
             </w:r>
@@ -1635,7 +1766,7 @@
     </w:tbl>
     <w:p>
       <w:pPr>
-        <w:spacing w:after="200"/>
+        <w:spacing w:after="160"/>
       </w:pPr>
     </w:p>
     <w:p>
@@ -1679,7 +1810,7 @@
     <w:p>
       <w:pPr>
         <w:pStyle w:val="Heading2"/>
-        <w:spacing w:after="120" w:before="200"/>
+        <w:spacing w:after="160" w:before="320"/>
       </w:pPr>
       <w:r>
         <w:t xml:space="preserve">Risk classification (feeds Module 6 directly)</w:t>
@@ -1692,7 +1823,7 @@
           <w:ilvl w:val="0"/>
           <w:numId w:val="1"/>
         </w:numPr>
-        <w:spacing w:after="100"/>
+        <w:spacing w:after="120"/>
       </w:pPr>
       <w:r>
         <w:rPr>
@@ -1709,7 +1840,7 @@
           <w:ilvl w:val="0"/>
           <w:numId w:val="1"/>
         </w:numPr>
-        <w:spacing w:after="100"/>
+        <w:spacing w:after="120"/>
       </w:pPr>
       <w:r>
         <w:rPr>
@@ -1726,7 +1857,7 @@
           <w:ilvl w:val="0"/>
           <w:numId w:val="1"/>
         </w:numPr>
-        <w:spacing w:after="100"/>
+        <w:spacing w:after="120"/>
       </w:pPr>
       <w:r>
         <w:rPr>
@@ -1764,7 +1895,7 @@
     <w:p>
       <w:pPr>
         <w:pStyle w:val="Heading2"/>
-        <w:spacing w:after="120" w:before="200"/>
+        <w:spacing w:after="160" w:before="320"/>
       </w:pPr>
       <w:r>
         <w:t xml:space="preserve">Failed-login tracking — finalized storage decision</w:t>
@@ -1795,7 +1926,7 @@
           <w:ilvl w:val="0"/>
           <w:numId w:val="1"/>
         </w:numPr>
-        <w:spacing w:after="100"/>
+        <w:spacing w:after="120"/>
       </w:pPr>
       <w:r>
         <w:t xml:space="preserve">Key: ztsaacm:failed_logins:{user_id}</w:t>
@@ -1808,7 +1939,7 @@
           <w:ilvl w:val="0"/>
           <w:numId w:val="1"/>
         </w:numPr>
-        <w:spacing w:after="100"/>
+        <w:spacing w:after="120"/>
       </w:pPr>
       <w:r>
         <w:t xml:space="preserve">Behavior: incremented on each failed POST /auth/login; TTL 15 minutes (auto-expiring, no cleanup job required); read at the moment of a *successful* login to decide whether the −15 penalty applies.</w:t>
@@ -1821,7 +1952,7 @@
           <w:ilvl w:val="0"/>
           <w:numId w:val="1"/>
         </w:numPr>
-        <w:spacing w:after="100"/>
+        <w:spacing w:after="120"/>
       </w:pPr>
       <w:r>
         <w:t xml:space="preserve">No permanent failed-login audit history is required elsewhere in the project, so a Postgres table was explicitly not used.</w:t>
@@ -1830,7 +1961,7 @@
     <w:p>
       <w:pPr>
         <w:pStyle w:val="Heading2"/>
-        <w:spacing w:after="120" w:before="200"/>
+        <w:spacing w:after="160" w:before="320"/>
       </w:pPr>
       <w:r>
         <w:t xml:space="preserve">Attack Simulation — VPN buttons (Module 9 tie-in)</w:t>
@@ -1861,7 +1992,7 @@
           <w:ilvl w:val="0"/>
           <w:numId w:val="1"/>
         </w:numPr>
-        <w:spacing w:after="100"/>
+        <w:spacing w:after="120"/>
       </w:pPr>
       <w:r>
         <w:rPr>
@@ -1881,7 +2012,7 @@
           <w:ilvl w:val="0"/>
           <w:numId w:val="1"/>
         </w:numPr>
-        <w:spacing w:after="100"/>
+        <w:spacing w:after="120"/>
       </w:pPr>
       <w:r>
         <w:rPr>
@@ -1923,23 +2054,13 @@
         <w:t xml:space="preserve">Status: the TOTP-hybrid design originally finalized below has been superseded at the developer's explicit request.</w:t>
       </w:r>
       <w:r>
-        <w:t xml:space="preserve"> TOTP (authenticator-app) MFA has been removed entirely — both as a login method and as a candidate mechanism for Module 7's future continuous/re-verification challenges. It is not to be reintroduced without a new explicit request. The full rationale, implementation notes, and verification record live in </w:t>
-      </w:r>
-      <w:r>
-        <w:rPr>
-          <w:rFonts w:ascii="Consolas" w:cs="Consolas" w:eastAsia="Consolas" w:hAnsi="Consolas"/>
-          <w:shd w:fill="EFEFEF" w:val="clear"/>
-        </w:rPr>
-        <w:t xml:space="preserve">Project status.md</w:t>
-      </w:r>
-      <w:r>
-        <w:t xml:space="preserve"> section 11 ("MFA Method Redesign — TOTP Removed, Email One-Time Codes for Every Login"); this section states the current design going forward. The original TOTP-hybrid draft is preserved just below (in the "Superseded original spec" subsection) for historical reference only — it does not describe the implemented system.</w:t>
+        <w:t xml:space="preserve"> TOTP (authenticator-app) MFA has been removed entirely — both as a login method and as a candidate mechanism for Module 7's future continuous/re-verification challenges. It is not to be reintroduced without a new explicit request. The full rationale, implementation notes, and verification record live in Project status.md section 11 ("MFA Method Redesign — TOTP Removed, Email One-Time Codes for Every Login"); this section states the current design going forward. The original TOTP-hybrid draft is preserved just below (in the "Superseded original spec" subsection) for historical reference only — it does not describe the implemented system.</w:t>
       </w:r>
     </w:p>
     <w:p>
       <w:pPr>
         <w:pStyle w:val="Heading2"/>
-        <w:spacing w:after="120" w:before="200"/>
+        <w:spacing w:after="160" w:before="320"/>
       </w:pPr>
       <w:r>
         <w:t xml:space="preserve">Trigger — driven directly by Module 5's risk band (unchanged)</w:t>
@@ -1952,7 +2073,7 @@
           <w:ilvl w:val="0"/>
           <w:numId w:val="1"/>
         </w:numPr>
-        <w:spacing w:after="100"/>
+        <w:spacing w:after="120"/>
       </w:pPr>
       <w:r>
         <w:rPr>
@@ -1972,7 +2093,7 @@
           <w:ilvl w:val="0"/>
           <w:numId w:val="1"/>
         </w:numPr>
-        <w:spacing w:after="100"/>
+        <w:spacing w:after="120"/>
       </w:pPr>
       <w:r>
         <w:rPr>
@@ -1992,7 +2113,7 @@
           <w:ilvl w:val="0"/>
           <w:numId w:val="1"/>
         </w:numPr>
-        <w:spacing w:after="100"/>
+        <w:spacing w:after="120"/>
       </w:pPr>
       <w:r>
         <w:rPr>
@@ -2023,7 +2144,7 @@
     <w:p>
       <w:pPr>
         <w:pStyle w:val="Heading2"/>
-        <w:spacing w:after="120" w:before="200"/>
+        <w:spacing w:after="160" w:before="320"/>
       </w:pPr>
       <w:r>
         <w:t xml:space="preserve">Session gating (unchanged)</w:t>
@@ -2050,7 +2171,7 @@
     <w:p>
       <w:pPr>
         <w:pStyle w:val="Heading2"/>
-        <w:spacing w:after="120" w:before="200"/>
+        <w:spacing w:after="160" w:before="320"/>
       </w:pPr>
       <w:r>
         <w:t xml:space="preserve">One MFA method — emailed one-time code, every login</w:t>
@@ -2063,7 +2184,7 @@
           <w:ilvl w:val="0"/>
           <w:numId w:val="1"/>
         </w:numPr>
-        <w:spacing w:after="100"/>
+        <w:spacing w:after="120"/>
       </w:pPr>
       <w:r>
         <w:rPr>
@@ -2083,7 +2204,7 @@
           <w:ilvl w:val="0"/>
           <w:numId w:val="1"/>
         </w:numPr>
-        <w:spacing w:after="100"/>
+        <w:spacing w:after="120"/>
       </w:pPr>
       <w:r>
         <w:t xml:space="preserve">The code is never stored in plaintext. It is hashed with a salted HMAC-SHA256 (salt per challenge, key derived from the app's JWT secret) before being persisted; only the hash and salt are stored.</w:t>
@@ -2096,60 +2217,20 @@
           <w:ilvl w:val="0"/>
           <w:numId w:val="1"/>
         </w:numPr>
-        <w:spacing w:after="100"/>
-      </w:pPr>
-      <w:r>
-        <w:t xml:space="preserve">Delivery is via real Gmail SMTP when </w:t>
-      </w:r>
-      <w:r>
-        <w:rPr>
-          <w:rFonts w:ascii="Consolas" w:cs="Consolas" w:eastAsia="Consolas" w:hAnsi="Consolas"/>
-          <w:shd w:fill="EFEFEF" w:val="clear"/>
-        </w:rPr>
-        <w:t xml:space="preserve">SMTP_USERNAME</w:t>
-      </w:r>
-      <w:r>
-        <w:t xml:space="preserve">/</w:t>
-      </w:r>
-      <w:r>
-        <w:rPr>
-          <w:rFonts w:ascii="Consolas" w:cs="Consolas" w:eastAsia="Consolas" w:hAnsi="Consolas"/>
-          <w:shd w:fill="EFEFEF" w:val="clear"/>
-        </w:rPr>
-        <w:t xml:space="preserve">SMTP_PASSWORD</w:t>
-      </w:r>
-      <w:r>
-        <w:t xml:space="preserve"> are configured. When SMTP is not configured (e.g. local development), the code is logged server-side and surfaced to the UI as a </w:t>
-      </w:r>
-      <w:r>
-        <w:rPr>
-          <w:rFonts w:ascii="Consolas" w:cs="Consolas" w:eastAsia="Consolas" w:hAnsi="Consolas"/>
-          <w:shd w:fill="EFEFEF" w:val="clear"/>
-        </w:rPr>
-        <w:t xml:space="preserve">dev_code</w:t>
-      </w:r>
-      <w:r>
-        <w:t xml:space="preserve"> for testing convenience — this dev-only exposure is controlled by config (</w:t>
-      </w:r>
-      <w:r>
-        <w:rPr>
-          <w:rFonts w:ascii="Consolas" w:cs="Consolas" w:eastAsia="Consolas" w:hAnsi="Consolas"/>
-          <w:shd w:fill="EFEFEF" w:val="clear"/>
-        </w:rPr>
-        <w:t xml:space="preserve">MFA_DEV_EXPOSE_CODE</w:t>
-      </w:r>
-      <w:r>
-        <w:t xml:space="preserve"> / non-production environment) and is never available when SMTP is actually configured.</w:t>
-      </w:r>
-    </w:p>
-    <w:p>
-      <w:pPr>
-        <w:pStyle w:val="ListParagraph"/>
-        <w:numPr>
-          <w:ilvl w:val="0"/>
-          <w:numId w:val="1"/>
-        </w:numPr>
-        <w:spacing w:after="100"/>
+        <w:spacing w:after="120"/>
+      </w:pPr>
+      <w:r>
+        <w:t xml:space="preserve">Delivery is via real Gmail SMTP when SMTP_USERNAME/SMTP_PASSWORD are configured. When SMTP is not configured (e.g. local development), the code is logged server-side and surfaced to the UI as a dev_code for testing convenience — this dev-only exposure is controlled by config (MFA_DEV_EXPOSE_CODE / non-production environment) and is never available when SMTP is actually configured.</w:t>
+      </w:r>
+    </w:p>
+    <w:p>
+      <w:pPr>
+        <w:pStyle w:val="ListParagraph"/>
+        <w:numPr>
+          <w:ilvl w:val="0"/>
+          <w:numId w:val="1"/>
+        </w:numPr>
+        <w:spacing w:after="120"/>
       </w:pPr>
       <w:r>
         <w:t xml:space="preserve">If SMTP is configured but the send itself fails (network/auth error at send time), the login attempt fails with HTTP 503 rather than silently issuing a challenge the user has no way to complete.</w:t>
@@ -2162,26 +2243,16 @@
           <w:ilvl w:val="0"/>
           <w:numId w:val="1"/>
         </w:numPr>
-        <w:spacing w:after="100"/>
-      </w:pPr>
-      <w:r>
-        <w:t xml:space="preserve">Challenge validity: </w:t>
-      </w:r>
-      <w:r>
-        <w:rPr>
-          <w:rFonts w:ascii="Consolas" w:cs="Consolas" w:eastAsia="Consolas" w:hAnsi="Consolas"/>
-          <w:shd w:fill="EFEFEF" w:val="clear"/>
-        </w:rPr>
-        <w:t xml:space="preserve">MFA_CHALLENGE_TTL_MINUTES</w:t>
-      </w:r>
-      <w:r>
-        <w:t xml:space="preserve"> (env-configured), consistent with the project's convention of not hardcoding timing values.</w:t>
+        <w:spacing w:after="120"/>
+      </w:pPr>
+      <w:r>
+        <w:t xml:space="preserve">Challenge validity: MFA_CHALLENGE_TTL_MINUTES (env-configured), consistent with the project's convention of not hardcoding timing values.</w:t>
       </w:r>
     </w:p>
     <w:p>
       <w:pPr>
         <w:pStyle w:val="Heading2"/>
-        <w:spacing w:after="120" w:before="200"/>
+        <w:spacing w:after="160" w:before="320"/>
       </w:pPr>
       <w:r>
         <w:t xml:space="preserve">Retry limit and lockout (unchanged in mechanism, no TOTP reference)</w:t>
@@ -2194,7 +2265,7 @@
           <w:ilvl w:val="0"/>
           <w:numId w:val="1"/>
         </w:numPr>
-        <w:spacing w:after="100"/>
+        <w:spacing w:after="120"/>
       </w:pPr>
       <w:r>
         <w:rPr>
@@ -2224,30 +2295,20 @@
           <w:ilvl w:val="0"/>
           <w:numId w:val="1"/>
         </w:numPr>
-        <w:spacing w:after="100"/>
-      </w:pPr>
-      <w:r>
-        <w:t xml:space="preserve">Lockout storage: Redis, key </w:t>
-      </w:r>
-      <w:r>
-        <w:rPr>
-          <w:rFonts w:ascii="Consolas" w:cs="Consolas" w:eastAsia="Consolas" w:hAnsi="Consolas"/>
-          <w:shd w:fill="EFEFEF" w:val="clear"/>
-        </w:rPr>
-        <w:t xml:space="preserve">ztsaacm:mfa_lockout:{user_id}</w:t>
-      </w:r>
-      <w:r>
-        <w:t xml:space="preserve">, 15-minute TTL, auto-expiring — same convention as Module 5's failed-login counter.</w:t>
-      </w:r>
-    </w:p>
-    <w:p>
-      <w:pPr>
-        <w:pStyle w:val="ListParagraph"/>
-        <w:numPr>
-          <w:ilvl w:val="0"/>
-          <w:numId w:val="1"/>
-        </w:numPr>
-        <w:spacing w:after="100"/>
+        <w:spacing w:after="120"/>
+      </w:pPr>
+      <w:r>
+        <w:t xml:space="preserve">Lockout storage: Redis, key ztsaacm:mfa_lockout:{user_id}, 15-minute TTL, auto-expiring — same convention as Module 5's failed-login counter.</w:t>
+      </w:r>
+    </w:p>
+    <w:p>
+      <w:pPr>
+        <w:pStyle w:val="ListParagraph"/>
+        <w:numPr>
+          <w:ilvl w:val="0"/>
+          <w:numId w:val="1"/>
+        </w:numPr>
+        <w:spacing w:after="120"/>
       </w:pPr>
       <w:r>
         <w:t xml:space="preserve">Failed-OTP attempts are tracked in a </w:t>
@@ -2260,33 +2321,13 @@
         <w:t xml:space="preserve">separate</w:t>
       </w:r>
       <w:r>
-        <w:t xml:space="preserve"> Redis counter (</w:t>
-      </w:r>
-      <w:r>
-        <w:rPr>
-          <w:rFonts w:ascii="Consolas" w:cs="Consolas" w:eastAsia="Consolas" w:hAnsi="Consolas"/>
-          <w:shd w:fill="EFEFEF" w:val="clear"/>
-        </w:rPr>
-        <w:t xml:space="preserve">ztsaacm:mfa_failed:{user_id}</w:t>
-      </w:r>
-      <w:r>
-        <w:t xml:space="preserve">) from Module 5's password-failure counter (</w:t>
-      </w:r>
-      <w:r>
-        <w:rPr>
-          <w:rFonts w:ascii="Consolas" w:cs="Consolas" w:eastAsia="Consolas" w:hAnsi="Consolas"/>
-          <w:shd w:fill="EFEFEF" w:val="clear"/>
-        </w:rPr>
-        <w:t xml:space="preserve">ztsaacm:failed_logins:{user_id}</w:t>
-      </w:r>
-      <w:r>
-        <w:t xml:space="preserve">).</w:t>
+        <w:t xml:space="preserve"> Redis counter (ztsaacm:mfa_failed:{user_id}) from Module 5's password-failure counter (ztsaacm:failed_logins:{user_id}).</w:t>
       </w:r>
     </w:p>
     <w:p>
       <w:pPr>
         <w:pStyle w:val="Heading2"/>
-        <w:spacing w:after="120" w:before="200"/>
+        <w:spacing w:after="160" w:before="320"/>
       </w:pPr>
       <w:r>
         <w:t xml:space="preserve">API shape — two-step challenge / verify (unchanged shape, method simplified)</w:t>
@@ -2299,7 +2340,7 @@
           <w:ilvl w:val="0"/>
           <w:numId w:val="1"/>
         </w:numPr>
-        <w:spacing w:after="100"/>
+        <w:spacing w:after="120"/>
       </w:pPr>
       <w:r>
         <w:rPr>
@@ -2319,7 +2360,7 @@
           <w:ilvl w:val="0"/>
           <w:numId w:val="1"/>
         </w:numPr>
-        <w:spacing w:after="100"/>
+        <w:spacing w:after="120"/>
       </w:pPr>
       <w:r>
         <w:t xml:space="preserve">LOW → issues the real JWT immediately, exactly as today.</w:t>
@@ -2332,7 +2373,7 @@
           <w:ilvl w:val="0"/>
           <w:numId w:val="1"/>
         </w:numPr>
-        <w:spacing w:after="100"/>
+        <w:spacing w:after="120"/>
       </w:pPr>
       <w:r>
         <w:t xml:space="preserve">MEDIUM → does </w:t>
@@ -2345,37 +2386,17 @@
         <w:t xml:space="preserve">not</w:t>
       </w:r>
       <w:r>
-        <w:t xml:space="preserve"> issue a JWT. Returns </w:t>
-      </w:r>
-      <w:r>
-        <w:rPr>
-          <w:rFonts w:ascii="Consolas" w:cs="Consolas" w:eastAsia="Consolas" w:hAnsi="Consolas"/>
-          <w:shd w:fill="EFEFEF" w:val="clear"/>
-        </w:rPr>
-        <w:t xml:space="preserve">mfa_required: true</w:t>
-      </w:r>
-      <w:r>
-        <w:t xml:space="preserve"> and a short-lived MFA challenge token (not a session credential). There is only one method (</w:t>
-      </w:r>
-      <w:r>
-        <w:rPr>
-          <w:rFonts w:ascii="Consolas" w:cs="Consolas" w:eastAsia="Consolas" w:hAnsi="Consolas"/>
-          <w:shd w:fill="EFEFEF" w:val="clear"/>
-        </w:rPr>
-        <w:t xml:space="preserve">email</w:t>
-      </w:r>
-      <w:r>
-        <w:t xml:space="preserve">), so no method field needs to be chosen between.</w:t>
-      </w:r>
-    </w:p>
-    <w:p>
-      <w:pPr>
-        <w:pStyle w:val="ListParagraph"/>
-        <w:numPr>
-          <w:ilvl w:val="0"/>
-          <w:numId w:val="1"/>
-        </w:numPr>
-        <w:spacing w:after="100"/>
+        <w:t xml:space="preserve"> issue a JWT. Returns mfa_required: true and a short-lived MFA challenge token (not a session credential). There is only one method (email), so no method field needs to be chosen between.</w:t>
+      </w:r>
+    </w:p>
+    <w:p>
+      <w:pPr>
+        <w:pStyle w:val="ListParagraph"/>
+        <w:numPr>
+          <w:ilvl w:val="0"/>
+          <w:numId w:val="1"/>
+        </w:numPr>
+        <w:spacing w:after="120"/>
       </w:pPr>
       <w:r>
         <w:t xml:space="preserve">HIGH → HTTP 403, no token of any kind, logs a Security Alert.</w:t>
@@ -2388,7 +2409,7 @@
           <w:ilvl w:val="0"/>
           <w:numId w:val="1"/>
         </w:numPr>
-        <w:spacing w:after="100"/>
+        <w:spacing w:after="120"/>
       </w:pPr>
       <w:r>
         <w:rPr>
@@ -2404,7 +2425,7 @@
     <w:p>
       <w:pPr>
         <w:pStyle w:val="Heading2"/>
-        <w:spacing w:after="120" w:before="200"/>
+        <w:spacing w:after="160" w:before="320"/>
       </w:pPr>
       <w:r>
         <w:t xml:space="preserve">Module 7 (future) — same mechanism, explicitly no TOTP</w:t>
@@ -2421,7 +2442,7 @@
     <w:p>
       <w:pPr>
         <w:pStyle w:val="Heading2"/>
-        <w:spacing w:after="120" w:before="200"/>
+        <w:spacing w:after="160" w:before="320"/>
       </w:pPr>
       <w:r>
         <w:t xml:space="preserve">Registration must not seed trust history (added 2026-09-10)</w:t>
@@ -2439,37 +2460,7 @@
         <w:t xml:space="preserve">Diagnosed and fixed 2026-09-10 — see `Project status.md` section 12 for the full root-cause trace.</w:t>
       </w:r>
       <w:r>
-        <w:t xml:space="preserve"> Registering an account (</w:t>
-      </w:r>
-      <w:r>
-        <w:rPr>
-          <w:rFonts w:ascii="Consolas" w:cs="Consolas" w:eastAsia="Consolas" w:hAnsi="Consolas"/>
-          <w:shd w:fill="EFEFEF" w:val="clear"/>
-        </w:rPr>
-        <w:t xml:space="preserve">POST /auth/register</w:t>
-      </w:r>
-      <w:r>
-        <w:t xml:space="preserve">) is deliberately not MFA-gated (Section 3/13's "no MFA gate on registration" line), but the application layer must not treat a successful registration as an authenticated session in the same sense a real login is. Doing so — specifically, opening the app's WebSocket session immediately after registering — lets that session's device/IP seed Module 5's </w:t>
-      </w:r>
-      <w:r>
-        <w:rPr>
-          <w:rFonts w:ascii="Consolas" w:cs="Consolas" w:eastAsia="Consolas" w:hAnsi="Consolas"/>
-          <w:shd w:fill="EFEFEF" w:val="clear"/>
-        </w:rPr>
-        <w:t xml:space="preserve">known_device</w:t>
-      </w:r>
-      <w:r>
-        <w:t xml:space="preserve">/</w:t>
-      </w:r>
-      <w:r>
-        <w:rPr>
-          <w:rFonts w:ascii="Consolas" w:cs="Consolas" w:eastAsia="Consolas" w:hAnsi="Consolas"/>
-          <w:shd w:fill="EFEFEF" w:val="clear"/>
-        </w:rPr>
-        <w:t xml:space="preserve">known_ip</w:t>
-      </w:r>
-      <w:r>
-        <w:t xml:space="preserve"> trust history before the account's first real login ever runs the Section 6 risk check, which can push that "first" login's score past the LOW threshold and skip the MFA challenge it is supposed to get. This defeats the guarantee in Section 6 that a genuinely first-ever login always lands in MEDIUM risk.</w:t>
+        <w:t xml:space="preserve"> Registering an account (POST /auth/register) is deliberately not MFA-gated (Section 3/13's "no MFA gate on registration" line), but the application layer must not treat a successful registration as an authenticated session in the same sense a real login is. Doing so — specifically, opening the app's WebSocket session immediately after registering — lets that session's device/IP seed Module 5's known_device/known_ip trust history before the account's first real login ever runs the Section 6 risk check, which can push that "first" login's score past the LOW threshold and skip the MFA challenge it is supposed to get. This defeats the guarantee in Section 6 that a genuinely first-ever login always lands in MEDIUM risk.</w:t>
       </w:r>
     </w:p>
     <w:p>
@@ -2484,33 +2475,13 @@
         <w:t xml:space="preserve">Constraint going forward</w:t>
       </w:r>
       <w:r>
-        <w:t xml:space="preserve">: a successful registration must return only a created account, not an authenticated session — the frontend must route the user back to a real sign-in step (a genuine </w:t>
-      </w:r>
-      <w:r>
-        <w:rPr>
-          <w:rFonts w:ascii="Consolas" w:cs="Consolas" w:eastAsia="Consolas" w:hAnsi="Consolas"/>
-          <w:shd w:fill="EFEFEF" w:val="clear"/>
-        </w:rPr>
-        <w:t xml:space="preserve">POST /auth/login</w:t>
-      </w:r>
-      <w:r>
-        <w:t xml:space="preserve">) before any session/WebSocket is opened, so Module 5/6's risk check always sees the account's *true* first login from a clean history. This is now the implemented behavior (frontend-only fix — </w:t>
-      </w:r>
-      <w:r>
-        <w:rPr>
-          <w:rFonts w:ascii="Consolas" w:cs="Consolas" w:eastAsia="Consolas" w:hAnsi="Consolas"/>
-          <w:shd w:fill="EFEFEF" w:val="clear"/>
-        </w:rPr>
-        <w:t xml:space="preserve">POST /auth/register</w:t>
-      </w:r>
-      <w:r>
-        <w:t xml:space="preserve">'s own API contract is unchanged).</w:t>
+        <w:t xml:space="preserve">: a successful registration must return only a created account, not an authenticated session — the frontend must route the user back to a real sign-in step (a genuine POST /auth/login) before any session/WebSocket is opened, so Module 5/6's risk check always sees the account's *true* first login from a clean history. This is now the implemented behavior (frontend-only fix — POST /auth/register's own API contract is unchanged).</w:t>
       </w:r>
     </w:p>
     <w:p>
       <w:pPr>
         <w:pStyle w:val="Heading2"/>
-        <w:spacing w:after="120" w:before="200"/>
+        <w:spacing w:after="160" w:before="320"/>
       </w:pPr>
       <w:r>
         <w:t xml:space="preserve">Post-fix regression: first-time-login 500 from an unapplied migration — diagnosed and fixed (2026-09-10)</w:t>
@@ -2521,123 +2492,13 @@
         <w:spacing w:after="160"/>
       </w:pPr>
       <w:r>
-        <w:t xml:space="preserve">Immediately after the registration fix above, every first-time login (brand-new accounts, and pre-existing accounts that had never logged in) started failing with what the browser reported as a CORS error. The actual status code was 500, not a CORS block — Firefox reports a missing </w:t>
-      </w:r>
-      <w:r>
-        <w:rPr>
-          <w:rFonts w:ascii="Consolas" w:cs="Consolas" w:eastAsia="Consolas" w:hAnsi="Consolas"/>
-          <w:shd w:fill="EFEFEF" w:val="clear"/>
-        </w:rPr>
-        <w:t xml:space="preserve">Access-Control-Allow-Origin</w:t>
-      </w:r>
-      <w:r>
-        <w:t xml:space="preserve"> header whenever the backend raises an unhandled exception, because the error response never passes back through the CORS middleware's header injection. The real cause: any account with no prior session history lands in MEDIUM risk on its first-ever login (Section 6/7's own guarantee), which triggers </w:t>
-      </w:r>
-      <w:r>
-        <w:rPr>
-          <w:rFonts w:ascii="Consolas" w:cs="Consolas" w:eastAsia="Consolas" w:hAnsi="Consolas"/>
-          <w:shd w:fill="EFEFEF" w:val="clear"/>
-        </w:rPr>
-        <w:t xml:space="preserve">mfa_service.create_challenge</w:t>
-      </w:r>
-      <w:r>
-        <w:t xml:space="preserve"> — an </w:t>
-      </w:r>
-      <w:r>
-        <w:rPr>
-          <w:rFonts w:ascii="Consolas" w:cs="Consolas" w:eastAsia="Consolas" w:hAnsi="Consolas"/>
-          <w:shd w:fill="EFEFEF" w:val="clear"/>
-        </w:rPr>
-        <w:t xml:space="preserve">INSERT</w:t>
-      </w:r>
-      <w:r>
-        <w:t xml:space="preserve"> into </w:t>
-      </w:r>
-      <w:r>
-        <w:rPr>
-          <w:rFonts w:ascii="Consolas" w:cs="Consolas" w:eastAsia="Consolas" w:hAnsi="Consolas"/>
-          <w:shd w:fill="EFEFEF" w:val="clear"/>
-        </w:rPr>
-        <w:t xml:space="preserve">mfa_challenges</w:t>
-      </w:r>
-      <w:r>
-        <w:t xml:space="preserve"> including </w:t>
-      </w:r>
-      <w:r>
-        <w:rPr>
-          <w:rFonts w:ascii="Consolas" w:cs="Consolas" w:eastAsia="Consolas" w:hAnsi="Consolas"/>
-          <w:shd w:fill="EFEFEF" w:val="clear"/>
-        </w:rPr>
-        <w:t xml:space="preserve">code_hash</w:t>
-      </w:r>
-      <w:r>
-        <w:t xml:space="preserve">/</w:t>
-      </w:r>
-      <w:r>
-        <w:rPr>
-          <w:rFonts w:ascii="Consolas" w:cs="Consolas" w:eastAsia="Consolas" w:hAnsi="Consolas"/>
-          <w:shd w:fill="EFEFEF" w:val="clear"/>
-        </w:rPr>
-        <w:t xml:space="preserve">code_salt</w:t>
-      </w:r>
-      <w:r>
-        <w:t xml:space="preserve">/</w:t>
-      </w:r>
-      <w:r>
-        <w:rPr>
-          <w:rFonts w:ascii="Consolas" w:cs="Consolas" w:eastAsia="Consolas" w:hAnsi="Consolas"/>
-          <w:shd w:fill="EFEFEF" w:val="clear"/>
-        </w:rPr>
-        <w:t xml:space="preserve">delivered_via</w:t>
-      </w:r>
-      <w:r>
-        <w:t xml:space="preserve">, three columns added by Alembic migration </w:t>
-      </w:r>
-      <w:r>
-        <w:rPr>
-          <w:rFonts w:ascii="Consolas" w:cs="Consolas" w:eastAsia="Consolas" w:hAnsi="Consolas"/>
-          <w:shd w:fill="EFEFEF" w:val="clear"/>
-        </w:rPr>
-        <w:t xml:space="preserve">0007_mfa_email_otp.py</w:t>
-      </w:r>
-      <w:r>
-        <w:t xml:space="preserve"> the same day. </w:t>
-      </w:r>
-      <w:r>
-        <w:rPr>
-          <w:rFonts w:ascii="Consolas" w:cs="Consolas" w:eastAsia="Consolas" w:hAnsi="Consolas"/>
-          <w:shd w:fill="EFEFEF" w:val="clear"/>
-        </w:rPr>
-        <w:t xml:space="preserve">alembic upgrade head</w:t>
-      </w:r>
-      <w:r>
-        <w:t xml:space="preserve"> had not been re-run against the live database after that migration was authored, so those columns didn't exist yet and every such insert failed. Accounts with existing history land in LOW risk, skip challenge creation, and were unaffected — which is exactly the pattern reported. No code defect; running </w:t>
-      </w:r>
-      <w:r>
-        <w:rPr>
-          <w:rFonts w:ascii="Consolas" w:cs="Consolas" w:eastAsia="Consolas" w:hAnsi="Consolas"/>
-          <w:shd w:fill="EFEFEF" w:val="clear"/>
-        </w:rPr>
-        <w:t xml:space="preserve">alembic upgrade head</w:t>
-      </w:r>
-      <w:r>
-        <w:t xml:space="preserve"> and restarting the backend resolved it. See </w:t>
-      </w:r>
-      <w:r>
-        <w:rPr>
-          <w:rFonts w:ascii="Consolas" w:cs="Consolas" w:eastAsia="Consolas" w:hAnsi="Consolas"/>
-          <w:shd w:fill="EFEFEF" w:val="clear"/>
-        </w:rPr>
-        <w:t xml:space="preserve">Project status.md</w:t>
-      </w:r>
-      <w:r>
-        <w:t xml:space="preserve"> section 13 for the full trace.</w:t>
+        <w:t xml:space="preserve">Immediately after the registration fix above, every first-time login (brand-new accounts, and pre-existing accounts that had never logged in) started failing with what the browser reported as a CORS error. The actual status code was 500, not a CORS block — Firefox reports a missing Access-Control-Allow-Origin header whenever the backend raises an unhandled exception, because the error response never passes back through the CORS middleware's header injection. The real cause: any account with no prior session history lands in MEDIUM risk on its first-ever login (Section 6/7's own guarantee), which triggers mfa_service.create_challenge — an INSERT into mfa_challenges including code_hash/code_salt/delivered_via, three columns added by Alembic migration 0007_mfa_email_otp.py the same day. alembic upgrade head had not been re-run against the live database after that migration was authored, so those columns didn't exist yet and every such insert failed. Accounts with existing history land in LOW risk, skip challenge creation, and were unaffected — which is exactly the pattern reported. No code defect; running alembic upgrade head and restarting the backend resolved it. See Project status.md section 13 for the full trace.</w:t>
       </w:r>
     </w:p>
     <w:p>
       <w:pPr>
         <w:pStyle w:val="Heading2"/>
-        <w:spacing w:after="120" w:before="200"/>
+        <w:spacing w:after="160" w:before="320"/>
       </w:pPr>
       <w:r>
         <w:t xml:space="preserve">SMTP configured for real email delivery — confirmed working (2026-09-10)</w:t>
@@ -2648,170 +2509,13 @@
         <w:spacing w:after="160"/>
       </w:pPr>
       <w:r>
-        <w:rPr>
-          <w:rFonts w:ascii="Consolas" w:cs="Consolas" w:eastAsia="Consolas" w:hAnsi="Consolas"/>
-          <w:shd w:fill="EFEFEF" w:val="clear"/>
-        </w:rPr>
-        <w:t xml:space="preserve">backend/.env</w:t>
-      </w:r>
-      <w:r>
-        <w:t xml:space="preserve"> now has a real Gmail SMTP relay configured (</w:t>
-      </w:r>
-      <w:r>
-        <w:rPr>
-          <w:rFonts w:ascii="Consolas" w:cs="Consolas" w:eastAsia="Consolas" w:hAnsi="Consolas"/>
-          <w:shd w:fill="EFEFEF" w:val="clear"/>
-        </w:rPr>
-        <w:t xml:space="preserve">SMTP_HOST=smtp.gmail.com</w:t>
-      </w:r>
-      <w:r>
-        <w:t xml:space="preserve">, </w:t>
-      </w:r>
-      <w:r>
-        <w:rPr>
-          <w:rFonts w:ascii="Consolas" w:cs="Consolas" w:eastAsia="Consolas" w:hAnsi="Consolas"/>
-          <w:shd w:fill="EFEFEF" w:val="clear"/>
-        </w:rPr>
-        <w:t xml:space="preserve">SMTP_PORT=587</w:t>
-      </w:r>
-      <w:r>
-        <w:t xml:space="preserve">, </w:t>
-      </w:r>
-      <w:r>
-        <w:rPr>
-          <w:rFonts w:ascii="Consolas" w:cs="Consolas" w:eastAsia="Consolas" w:hAnsi="Consolas"/>
-          <w:shd w:fill="EFEFEF" w:val="clear"/>
-        </w:rPr>
-        <w:t xml:space="preserve">SMTP_USE_TLS=true</w:t>
-      </w:r>
-      <w:r>
-        <w:t xml:space="preserve">, plus a sending Gmail address and its App Password in </w:t>
-      </w:r>
-      <w:r>
-        <w:rPr>
-          <w:rFonts w:ascii="Consolas" w:cs="Consolas" w:eastAsia="Consolas" w:hAnsi="Consolas"/>
-          <w:shd w:fill="EFEFEF" w:val="clear"/>
-        </w:rPr>
-        <w:t xml:space="preserve">SMTP_USERNAME</w:t>
-      </w:r>
-      <w:r>
-        <w:t xml:space="preserve">/</w:t>
-      </w:r>
-      <w:r>
-        <w:rPr>
-          <w:rFonts w:ascii="Consolas" w:cs="Consolas" w:eastAsia="Consolas" w:hAnsi="Consolas"/>
-          <w:shd w:fill="EFEFEF" w:val="clear"/>
-        </w:rPr>
-        <w:t xml:space="preserve">SMTP_PASSWORD</w:t>
-      </w:r>
-      <w:r>
-        <w:t xml:space="preserve">). This is configuration only — </w:t>
-      </w:r>
-      <w:r>
-        <w:rPr>
-          <w:rFonts w:ascii="Consolas" w:cs="Consolas" w:eastAsia="Consolas" w:hAnsi="Consolas"/>
-          <w:shd w:fill="EFEFEF" w:val="clear"/>
-        </w:rPr>
-        <w:t xml:space="preserve">email_otp.py</w:t>
-      </w:r>
-      <w:r>
-        <w:t xml:space="preserve">'s real-send path already existed and required no code change. </w:t>
-      </w:r>
-      <w:r>
-        <w:rPr>
-          <w:rFonts w:ascii="Consolas" w:cs="Consolas" w:eastAsia="Consolas" w:hAnsi="Consolas"/>
-          <w:shd w:fill="EFEFEF" w:val="clear"/>
-        </w:rPr>
-        <w:t xml:space="preserve">.env</w:t>
-      </w:r>
-      <w:r>
-        <w:t xml:space="preserve"> is gitignored and was not committed; the credentials never enter git history. A standalone check, </w:t>
-      </w:r>
-      <w:r>
-        <w:rPr>
-          <w:rFonts w:ascii="Consolas" w:cs="Consolas" w:eastAsia="Consolas" w:hAnsi="Consolas"/>
-          <w:shd w:fill="EFEFEF" w:val="clear"/>
-        </w:rPr>
-        <w:t xml:space="preserve">backend/app/services/mfa/smtp_check.py</w:t>
-      </w:r>
-      <w:r>
-        <w:t xml:space="preserve"> (</w:t>
-      </w:r>
-      <w:r>
-        <w:rPr>
-          <w:rFonts w:ascii="Consolas" w:cs="Consolas" w:eastAsia="Consolas" w:hAnsi="Consolas"/>
-          <w:shd w:fill="EFEFEF" w:val="clear"/>
-        </w:rPr>
-        <w:t xml:space="preserve">python -m app.services.mfa.smtp_check &lt;email&gt;</w:t>
-      </w:r>
-      <w:r>
-        <w:t xml:space="preserve">), was added to verify SMTP with one command, entirely outside the login/MFA flow. Its first run caught a real bug — </w:t>
-      </w:r>
-      <w:r>
-        <w:rPr>
-          <w:rFonts w:ascii="Consolas" w:cs="Consolas" w:eastAsia="Consolas" w:hAnsi="Consolas"/>
-          <w:shd w:fill="EFEFEF" w:val="clear"/>
-        </w:rPr>
-        <w:t xml:space="preserve">SMTP_USERNAME</w:t>
-      </w:r>
-      <w:r>
-        <w:t xml:space="preserve"> had two letters transposed (</w:t>
-      </w:r>
-      <w:r>
-        <w:rPr>
-          <w:rFonts w:ascii="Consolas" w:cs="Consolas" w:eastAsia="Consolas" w:hAnsi="Consolas"/>
-          <w:shd w:fill="EFEFEF" w:val="clear"/>
-        </w:rPr>
-        <w:t xml:space="preserve">ztcaasm...</w:t>
-      </w:r>
-      <w:r>
-        <w:t xml:space="preserve"> instead of </w:t>
-      </w:r>
-      <w:r>
-        <w:rPr>
-          <w:rFonts w:ascii="Consolas" w:cs="Consolas" w:eastAsia="Consolas" w:hAnsi="Consolas"/>
-          <w:shd w:fill="EFEFEF" w:val="clear"/>
-        </w:rPr>
-        <w:t xml:space="preserve">ztsaacm...</w:t>
-      </w:r>
-      <w:r>
-        <w:t xml:space="preserve">), which Gmail correctly rejected with a </w:t>
-      </w:r>
-      <w:r>
-        <w:rPr>
-          <w:rFonts w:ascii="Consolas" w:cs="Consolas" w:eastAsia="Consolas" w:hAnsi="Consolas"/>
-          <w:shd w:fill="EFEFEF" w:val="clear"/>
-        </w:rPr>
-        <w:t xml:space="preserve">535</w:t>
-      </w:r>
-      <w:r>
-        <w:t xml:space="preserve"> auth error — not an App Password problem. After correcting the spelling, the check succeeded and the developer confirmed the code was received in the target inbox. Module 6's email-OTP delivery is now live end-to-end. See </w:t>
-      </w:r>
-      <w:r>
-        <w:rPr>
-          <w:rFonts w:ascii="Consolas" w:cs="Consolas" w:eastAsia="Consolas" w:hAnsi="Consolas"/>
-          <w:shd w:fill="EFEFEF" w:val="clear"/>
-        </w:rPr>
-        <w:t xml:space="preserve">Project status.md</w:t>
-      </w:r>
-      <w:r>
-        <w:t xml:space="preserve"> sections 14-15 for the full trace, including the </w:t>
-      </w:r>
-      <w:r>
-        <w:rPr>
-          <w:rFonts w:ascii="Consolas" w:cs="Consolas" w:eastAsia="Consolas" w:hAnsi="Consolas"/>
-          <w:shd w:fill="EFEFEF" w:val="clear"/>
-        </w:rPr>
-        <w:t xml:space="preserve">dev_code</w:t>
-      </w:r>
-      <w:r>
-        <w:t xml:space="preserve"> UI removal this unblocked (below).</w:t>
+        <w:t xml:space="preserve">backend/.env now has a real Gmail SMTP relay configured (SMTP_HOST=smtp.gmail.com, SMTP_PORT=587, SMTP_USE_TLS=true, plus a sending Gmail address and its App Password in SMTP_USERNAME/SMTP_PASSWORD). This is configuration only — email_otp.py's real-send path already existed and required no code change. .env is gitignored and was not committed; the credentials never enter git history. A standalone check, backend/app/services/mfa/smtp_check.py (python -m app.services.mfa.smtp_check &lt;email&gt;), was added to verify SMTP with one command, entirely outside the login/MFA flow. Its first run caught a real bug — SMTP_USERNAME had two letters transposed (ztcaasm... instead of ztsaacm...), which Gmail correctly rejected with a 535 auth error — not an App Password problem. After correcting the spelling, the check succeeded and the developer confirmed the code was received in the target inbox. Module 6's email-OTP delivery is now live end-to-end. See Project status.md sections 14-15 for the full trace, including the dev_code UI removal this unblocked (below).</w:t>
       </w:r>
     </w:p>
     <w:p>
       <w:pPr>
         <w:pStyle w:val="Heading2"/>
-        <w:spacing w:after="120" w:before="200"/>
+        <w:spacing w:after="160" w:before="320"/>
       </w:pPr>
       <w:r>
         <w:t xml:space="preserve">`dev_code` removed from the MFA screen (2026-09-10)</w:t>
@@ -2822,83 +2526,13 @@
         <w:spacing w:after="160"/>
       </w:pPr>
       <w:r>
-        <w:t xml:space="preserve">With SMTP confirmed working, </w:t>
-      </w:r>
-      <w:r>
-        <w:rPr>
-          <w:rFonts w:ascii="Consolas" w:cs="Consolas" w:eastAsia="Consolas" w:hAnsi="Consolas"/>
-          <w:shd w:fill="EFEFEF" w:val="clear"/>
-        </w:rPr>
-        <w:t xml:space="preserve">frontend/src/pages/Login.tsx</w:t>
-      </w:r>
-      <w:r>
-        <w:t xml:space="preserve"> no longer displays </w:t>
-      </w:r>
-      <w:r>
-        <w:rPr>
-          <w:rFonts w:ascii="Consolas" w:cs="Consolas" w:eastAsia="Consolas" w:hAnsi="Consolas"/>
-          <w:shd w:fill="EFEFEF" w:val="clear"/>
-        </w:rPr>
-        <w:t xml:space="preserve">challenge.dev_code</w:t>
-      </w:r>
-      <w:r>
-        <w:t xml:space="preserve"> on the MFA verification step. This is UI-only: the backend's dev-logging fallback (</w:t>
-      </w:r>
-      <w:r>
-        <w:rPr>
-          <w:rFonts w:ascii="Consolas" w:cs="Consolas" w:eastAsia="Consolas" w:hAnsi="Consolas"/>
-          <w:shd w:fill="EFEFEF" w:val="clear"/>
-        </w:rPr>
-        <w:t xml:space="preserve">mfa/service.py</w:t>
-      </w:r>
-      <w:r>
-        <w:t xml:space="preserve">'s </w:t>
-      </w:r>
-      <w:r>
-        <w:rPr>
-          <w:rFonts w:ascii="Consolas" w:cs="Consolas" w:eastAsia="Consolas" w:hAnsi="Consolas"/>
-          <w:shd w:fill="EFEFEF" w:val="clear"/>
-        </w:rPr>
-        <w:t xml:space="preserve">_dev_exposed()</w:t>
-      </w:r>
-      <w:r>
-        <w:t xml:space="preserve">, </w:t>
-      </w:r>
-      <w:r>
-        <w:rPr>
-          <w:rFonts w:ascii="Consolas" w:cs="Consolas" w:eastAsia="Consolas" w:hAnsi="Consolas"/>
-          <w:shd w:fill="EFEFEF" w:val="clear"/>
-        </w:rPr>
-        <w:t xml:space="preserve">email_otp.py</w:t>
-      </w:r>
-      <w:r>
-        <w:t xml:space="preserve">'s dev-log path) and the </w:t>
-      </w:r>
-      <w:r>
-        <w:rPr>
-          <w:rFonts w:ascii="Consolas" w:cs="Consolas" w:eastAsia="Consolas" w:hAnsi="Consolas"/>
-          <w:shd w:fill="EFEFEF" w:val="clear"/>
-        </w:rPr>
-        <w:t xml:space="preserve">dev_code</w:t>
-      </w:r>
-      <w:r>
-        <w:t xml:space="preserve"> field on </w:t>
-      </w:r>
-      <w:r>
-        <w:rPr>
-          <w:rFonts w:ascii="Consolas" w:cs="Consolas" w:eastAsia="Consolas" w:hAnsi="Consolas"/>
-          <w:shd w:fill="EFEFEF" w:val="clear"/>
-        </w:rPr>
-        <w:t xml:space="preserve">MFAChallengeOut</w:t>
-      </w:r>
-      <w:r>
-        <w:t xml:space="preserve"> are untouched, so if SMTP is ever unconfigured again (a fresh local dev setup, CI, etc.) the backend still dev-logs the code and still returns it in the API response — the frontend simply no longer renders it. Module 6 is now feature-complete as designed: every MFA-required login gets a genuinely emailed one-time code, with no visible dev/test fallback in the UI.</w:t>
+        <w:t xml:space="preserve">With SMTP confirmed working, frontend/src/pages/Login.tsx no longer displays challenge.dev_code on the MFA verification step. This is UI-only: the backend's dev-logging fallback (mfa/service.py's _dev_exposed(), email_otp.py's dev-log path) and the dev_code field on MFAChallengeOut are untouched, so if SMTP is ever unconfigured again (a fresh local dev setup, CI, etc.) the backend still dev-logs the code and still returns it in the API response — the frontend simply no longer renders it. Module 6 is now feature-complete as designed: every MFA-required login gets a genuinely emailed one-time code, with no visible dev/test fallback in the UI.</w:t>
       </w:r>
     </w:p>
     <w:p>
       <w:pPr>
         <w:pStyle w:val="Heading2"/>
-        <w:spacing w:after="120" w:before="200"/>
+        <w:spacing w:after="160" w:before="320"/>
       </w:pPr>
       <w:r>
         <w:t xml:space="preserve">Superseded original spec (TOTP-hybrid — for historical reference only, not implemented)</w:t>
@@ -2909,23 +2543,13 @@
         <w:spacing w:after="160"/>
       </w:pPr>
       <w:r>
-        <w:t xml:space="preserve">The project's MFA design originally called for TOTP as the primary method (used after a one-time enrollment) with email OTP as a first-login bootstrap mechanism only. Under that design: a user's first MFA-required login would use an emailed code, immediately followed by mandatory TOTP enrollment (QR code, encrypted-at-rest secret via </w:t>
-      </w:r>
-      <w:r>
-        <w:rPr>
-          <w:rFonts w:ascii="Consolas" w:cs="Consolas" w:eastAsia="Consolas" w:hAnsi="Consolas"/>
-          <w:shd w:fill="EFEFEF" w:val="clear"/>
-        </w:rPr>
-        <w:t xml:space="preserve">MFA_TOTP_ENCRYPTION_KEY</w:t>
-      </w:r>
-      <w:r>
-        <w:t xml:space="preserve">); every subsequent login would then use a TOTP code (30-second step, ±1 step tolerance) instead of email. This hybrid design was fully specified but was replaced, before being built out this way, by the always-email design described above. It is kept here only so the project's history is traceable — it must not be re-implemented without a new explicit request.</w:t>
+        <w:t xml:space="preserve">The project's MFA design originally called for TOTP as the primary method (used after a one-time enrollment) with email OTP as a first-login bootstrap mechanism only. Under that design: a user's first MFA-required login would use an emailed code, immediately followed by mandatory TOTP enrollment (QR code, encrypted-at-rest secret via MFA_TOTP_ENCRYPTION_KEY); every subsequent login would then use a TOTP code (30-second step, ±1 step tolerance) instead of email. This hybrid design was fully specified but was replaced, before being built out this way, by the always-email design described above. It is kept here only so the project's history is traceable — it must not be re-implemented without a new explicit request.</w:t>
       </w:r>
     </w:p>
     <w:p>
       <w:pPr>
         <w:pStyle w:val="Heading2"/>
-        <w:spacing w:after="120" w:before="200"/>
+        <w:spacing w:after="160" w:before="320"/>
       </w:pPr>
       <w:r>
         <w:t xml:space="preserve">Finalized spec summary (current, as implemented)</w:t>
@@ -2933,7 +2557,7 @@
     </w:p>
     <w:tbl>
       <w:tblPr>
-        <w:tblW w:type="dxa" w:w="9360"/>
+        <w:tblW w:type="dxa" w:w="9350"/>
         <w:tblBorders>
           <w:top w:val="single" w:color="auto" w:sz="4"/>
           <w:left w:val="single" w:color="auto" w:sz="4"/>
@@ -2944,8 +2568,8 @@
         </w:tblBorders>
       </w:tblPr>
       <w:tblGrid>
-        <w:gridCol w:w="4680"/>
-        <w:gridCol w:w="4680"/>
+        <w:gridCol w:w="4675"/>
+        <w:gridCol w:w="4675"/>
       </w:tblGrid>
       <w:tr>
         <w:trPr>
@@ -2953,13 +2577,16 @@
         </w:trPr>
         <w:tc>
           <w:tcPr>
-            <w:tcW w:type="dxa" w:w="4680"/>
-            <w:shd w:fill="D9E2F3" w:val="clear"/>
-          </w:tcPr>
-          <w:p>
-            <w:pPr>
-              <w:spacing w:after="40"/>
-            </w:pPr>
+            <w:tcW w:type="dxa" w:w="4675"/>
+            <w:shd w:fill="DDE6F2" w:val="clear"/>
+            <w:tcMar>
+              <w:top w:type="dxa" w:w="80"/>
+              <w:left w:type="dxa" w:w="100"/>
+              <w:bottom w:type="dxa" w:w="80"/>
+              <w:right w:type="dxa" w:w="100"/>
+            </w:tcMar>
+          </w:tcPr>
+          <w:p>
             <w:r>
               <w:rPr>
                 <w:b/>
@@ -2971,13 +2598,16 @@
         </w:tc>
         <w:tc>
           <w:tcPr>
-            <w:tcW w:type="dxa" w:w="4680"/>
-            <w:shd w:fill="D9E2F3" w:val="clear"/>
-          </w:tcPr>
-          <w:p>
-            <w:pPr>
-              <w:spacing w:after="40"/>
-            </w:pPr>
+            <w:tcW w:type="dxa" w:w="4675"/>
+            <w:shd w:fill="DDE6F2" w:val="clear"/>
+            <w:tcMar>
+              <w:top w:type="dxa" w:w="80"/>
+              <w:left w:type="dxa" w:w="100"/>
+              <w:bottom w:type="dxa" w:w="80"/>
+              <w:right w:type="dxa" w:w="100"/>
+            </w:tcMar>
+          </w:tcPr>
+          <w:p>
             <w:r>
               <w:rPr>
                 <w:b/>
@@ -2994,12 +2624,15 @@
         </w:trPr>
         <w:tc>
           <w:tcPr>
-            <w:tcW w:type="dxa" w:w="4680"/>
-          </w:tcPr>
-          <w:p>
-            <w:pPr>
-              <w:spacing w:after="40"/>
-            </w:pPr>
+            <w:tcW w:type="dxa" w:w="4675"/>
+            <w:tcMar>
+              <w:top w:type="dxa" w:w="80"/>
+              <w:left w:type="dxa" w:w="100"/>
+              <w:bottom w:type="dxa" w:w="80"/>
+              <w:right w:type="dxa" w:w="100"/>
+            </w:tcMar>
+          </w:tcPr>
+          <w:p>
             <w:r>
               <w:t xml:space="preserve">MFA trigger</w:t>
             </w:r>
@@ -3007,12 +2640,15 @@
         </w:tc>
         <w:tc>
           <w:tcPr>
-            <w:tcW w:type="dxa" w:w="4680"/>
-          </w:tcPr>
-          <w:p>
-            <w:pPr>
-              <w:spacing w:after="40"/>
-            </w:pPr>
+            <w:tcW w:type="dxa" w:w="4675"/>
+            <w:tcMar>
+              <w:top w:type="dxa" w:w="80"/>
+              <w:left w:type="dxa" w:w="100"/>
+              <w:bottom w:type="dxa" w:w="80"/>
+              <w:right w:type="dxa" w:w="100"/>
+            </w:tcMar>
+          </w:tcPr>
+          <w:p>
             <w:r>
               <w:t xml:space="preserve">Module 5 risk band — LOW = Allow, MEDIUM = MFA required, HIGH = hard block</w:t>
             </w:r>
@@ -3025,12 +2661,15 @@
         </w:trPr>
         <w:tc>
           <w:tcPr>
-            <w:tcW w:type="dxa" w:w="4680"/>
-          </w:tcPr>
-          <w:p>
-            <w:pPr>
-              <w:spacing w:after="40"/>
-            </w:pPr>
+            <w:tcW w:type="dxa" w:w="4675"/>
+            <w:tcMar>
+              <w:top w:type="dxa" w:w="80"/>
+              <w:left w:type="dxa" w:w="100"/>
+              <w:bottom w:type="dxa" w:w="80"/>
+              <w:right w:type="dxa" w:w="100"/>
+            </w:tcMar>
+          </w:tcPr>
+          <w:p>
             <w:r>
               <w:t xml:space="preserve">Session gating</w:t>
             </w:r>
@@ -3038,12 +2677,15 @@
         </w:tc>
         <w:tc>
           <w:tcPr>
-            <w:tcW w:type="dxa" w:w="4680"/>
-          </w:tcPr>
-          <w:p>
-            <w:pPr>
-              <w:spacing w:after="40"/>
-            </w:pPr>
+            <w:tcW w:type="dxa" w:w="4675"/>
+            <w:tcMar>
+              <w:top w:type="dxa" w:w="80"/>
+              <w:left w:type="dxa" w:w="100"/>
+              <w:bottom w:type="dxa" w:w="80"/>
+              <w:right w:type="dxa" w:w="100"/>
+            </w:tcMar>
+          </w:tcPr>
+          <w:p>
             <w:r>
               <w:t xml:space="preserve">Session created only after MFA passes; nothing opens for MEDIUM/HIGH before then</w:t>
             </w:r>
@@ -3056,12 +2698,15 @@
         </w:trPr>
         <w:tc>
           <w:tcPr>
-            <w:tcW w:type="dxa" w:w="4680"/>
-          </w:tcPr>
-          <w:p>
-            <w:pPr>
-              <w:spacing w:after="40"/>
-            </w:pPr>
+            <w:tcW w:type="dxa" w:w="4675"/>
+            <w:tcMar>
+              <w:top w:type="dxa" w:w="80"/>
+              <w:left w:type="dxa" w:w="100"/>
+              <w:bottom w:type="dxa" w:w="80"/>
+              <w:right w:type="dxa" w:w="100"/>
+            </w:tcMar>
+          </w:tcPr>
+          <w:p>
             <w:r>
               <w:t xml:space="preserve">Method</w:t>
             </w:r>
@@ -3069,12 +2714,15 @@
         </w:tc>
         <w:tc>
           <w:tcPr>
-            <w:tcW w:type="dxa" w:w="4680"/>
-          </w:tcPr>
-          <w:p>
-            <w:pPr>
-              <w:spacing w:after="40"/>
-            </w:pPr>
+            <w:tcW w:type="dxa" w:w="4675"/>
+            <w:tcMar>
+              <w:top w:type="dxa" w:w="80"/>
+              <w:left w:type="dxa" w:w="100"/>
+              <w:bottom w:type="dxa" w:w="80"/>
+              <w:right w:type="dxa" w:w="100"/>
+            </w:tcMar>
+          </w:tcPr>
+          <w:p>
             <w:r>
               <w:t xml:space="preserve">Email one-time code — the only method, used on every MFA-required login, no enrollment state</w:t>
             </w:r>
@@ -3087,12 +2735,15 @@
         </w:trPr>
         <w:tc>
           <w:tcPr>
-            <w:tcW w:type="dxa" w:w="4680"/>
-          </w:tcPr>
-          <w:p>
-            <w:pPr>
-              <w:spacing w:after="40"/>
-            </w:pPr>
+            <w:tcW w:type="dxa" w:w="4675"/>
+            <w:tcMar>
+              <w:top w:type="dxa" w:w="80"/>
+              <w:left w:type="dxa" w:w="100"/>
+              <w:bottom w:type="dxa" w:w="80"/>
+              <w:right w:type="dxa" w:w="100"/>
+            </w:tcMar>
+          </w:tcPr>
+          <w:p>
             <w:r>
               <w:t xml:space="preserve">Code generation</w:t>
             </w:r>
@@ -3100,12 +2751,15 @@
         </w:tc>
         <w:tc>
           <w:tcPr>
-            <w:tcW w:type="dxa" w:w="4680"/>
-          </w:tcPr>
-          <w:p>
-            <w:pPr>
-              <w:spacing w:after="40"/>
-            </w:pPr>
+            <w:tcW w:type="dxa" w:w="4675"/>
+            <w:tcMar>
+              <w:top w:type="dxa" w:w="80"/>
+              <w:left w:type="dxa" w:w="100"/>
+              <w:bottom w:type="dxa" w:w="80"/>
+              <w:right w:type="dxa" w:w="100"/>
+            </w:tcMar>
+          </w:tcPr>
+          <w:p>
             <w:r>
               <w:t xml:space="preserve">Cryptographically random 6-digit code per challenge</w:t>
             </w:r>
@@ -3118,12 +2772,15 @@
         </w:trPr>
         <w:tc>
           <w:tcPr>
-            <w:tcW w:type="dxa" w:w="4680"/>
-          </w:tcPr>
-          <w:p>
-            <w:pPr>
-              <w:spacing w:after="40"/>
-            </w:pPr>
+            <w:tcW w:type="dxa" w:w="4675"/>
+            <w:tcMar>
+              <w:top w:type="dxa" w:w="80"/>
+              <w:left w:type="dxa" w:w="100"/>
+              <w:bottom w:type="dxa" w:w="80"/>
+              <w:right w:type="dxa" w:w="100"/>
+            </w:tcMar>
+          </w:tcPr>
+          <w:p>
             <w:r>
               <w:t xml:space="preserve">Code storage</w:t>
             </w:r>
@@ -3131,12 +2788,15 @@
         </w:tc>
         <w:tc>
           <w:tcPr>
-            <w:tcW w:type="dxa" w:w="4680"/>
-          </w:tcPr>
-          <w:p>
-            <w:pPr>
-              <w:spacing w:after="40"/>
-            </w:pPr>
+            <w:tcW w:type="dxa" w:w="4675"/>
+            <w:tcMar>
+              <w:top w:type="dxa" w:w="80"/>
+              <w:left w:type="dxa" w:w="100"/>
+              <w:bottom w:type="dxa" w:w="80"/>
+              <w:right w:type="dxa" w:w="100"/>
+            </w:tcMar>
+          </w:tcPr>
+          <w:p>
             <w:r>
               <w:t xml:space="preserve">Salted HMAC-SHA256 hash only; plaintext never persisted</w:t>
             </w:r>
@@ -3149,12 +2809,15 @@
         </w:trPr>
         <w:tc>
           <w:tcPr>
-            <w:tcW w:type="dxa" w:w="4680"/>
-          </w:tcPr>
-          <w:p>
-            <w:pPr>
-              <w:spacing w:after="40"/>
-            </w:pPr>
+            <w:tcW w:type="dxa" w:w="4675"/>
+            <w:tcMar>
+              <w:top w:type="dxa" w:w="80"/>
+              <w:left w:type="dxa" w:w="100"/>
+              <w:bottom w:type="dxa" w:w="80"/>
+              <w:right w:type="dxa" w:w="100"/>
+            </w:tcMar>
+          </w:tcPr>
+          <w:p>
             <w:r>
               <w:t xml:space="preserve">Delivery</w:t>
             </w:r>
@@ -3162,12 +2825,15 @@
         </w:tc>
         <w:tc>
           <w:tcPr>
-            <w:tcW w:type="dxa" w:w="4680"/>
-          </w:tcPr>
-          <w:p>
-            <w:pPr>
-              <w:spacing w:after="40"/>
-            </w:pPr>
+            <w:tcW w:type="dxa" w:w="4675"/>
+            <w:tcMar>
+              <w:top w:type="dxa" w:w="80"/>
+              <w:left w:type="dxa" w:w="100"/>
+              <w:bottom w:type="dxa" w:w="80"/>
+              <w:right w:type="dxa" w:w="100"/>
+            </w:tcMar>
+          </w:tcPr>
+          <w:p>
             <w:r>
               <w:t xml:space="preserve">Real Gmail SMTP (confirmed working 2026-09-10); falls back to dev-logged server-side (no longer surfaced in the UI) if SMTP is ever unconfigured</w:t>
             </w:r>
@@ -3180,12 +2846,15 @@
         </w:trPr>
         <w:tc>
           <w:tcPr>
-            <w:tcW w:type="dxa" w:w="4680"/>
-          </w:tcPr>
-          <w:p>
-            <w:pPr>
-              <w:spacing w:after="40"/>
-            </w:pPr>
+            <w:tcW w:type="dxa" w:w="4675"/>
+            <w:tcMar>
+              <w:top w:type="dxa" w:w="80"/>
+              <w:left w:type="dxa" w:w="100"/>
+              <w:bottom w:type="dxa" w:w="80"/>
+              <w:right w:type="dxa" w:w="100"/>
+            </w:tcMar>
+          </w:tcPr>
+          <w:p>
             <w:r>
               <w:t xml:space="preserve">Delivery failure</w:t>
             </w:r>
@@ -3193,12 +2862,15 @@
         </w:tc>
         <w:tc>
           <w:tcPr>
-            <w:tcW w:type="dxa" w:w="4680"/>
-          </w:tcPr>
-          <w:p>
-            <w:pPr>
-              <w:spacing w:after="40"/>
-            </w:pPr>
+            <w:tcW w:type="dxa" w:w="4675"/>
+            <w:tcMar>
+              <w:top w:type="dxa" w:w="80"/>
+              <w:left w:type="dxa" w:w="100"/>
+              <w:bottom w:type="dxa" w:w="80"/>
+              <w:right w:type="dxa" w:w="100"/>
+            </w:tcMar>
+          </w:tcPr>
+          <w:p>
             <w:r>
               <w:t xml:space="preserve">HTTP 503 on login if SMTP is configured but sending fails</w:t>
             </w:r>
@@ -3211,12 +2883,15 @@
         </w:trPr>
         <w:tc>
           <w:tcPr>
-            <w:tcW w:type="dxa" w:w="4680"/>
-          </w:tcPr>
-          <w:p>
-            <w:pPr>
-              <w:spacing w:after="40"/>
-            </w:pPr>
+            <w:tcW w:type="dxa" w:w="4675"/>
+            <w:tcMar>
+              <w:top w:type="dxa" w:w="80"/>
+              <w:left w:type="dxa" w:w="100"/>
+              <w:bottom w:type="dxa" w:w="80"/>
+              <w:right w:type="dxa" w:w="100"/>
+            </w:tcMar>
+          </w:tcPr>
+          <w:p>
             <w:r>
               <w:t xml:space="preserve">Retry limit</w:t>
             </w:r>
@@ -3224,12 +2899,15 @@
         </w:tc>
         <w:tc>
           <w:tcPr>
-            <w:tcW w:type="dxa" w:w="4680"/>
-          </w:tcPr>
-          <w:p>
-            <w:pPr>
-              <w:spacing w:after="40"/>
-            </w:pPr>
+            <w:tcW w:type="dxa" w:w="4675"/>
+            <w:tcMar>
+              <w:top w:type="dxa" w:w="80"/>
+              <w:left w:type="dxa" w:w="100"/>
+              <w:bottom w:type="dxa" w:w="80"/>
+              <w:right w:type="dxa" w:w="100"/>
+            </w:tcMar>
+          </w:tcPr>
+          <w:p>
             <w:r>
               <w:t xml:space="preserve">3 wrong attempts</w:t>
             </w:r>
@@ -3242,12 +2920,15 @@
         </w:trPr>
         <w:tc>
           <w:tcPr>
-            <w:tcW w:type="dxa" w:w="4680"/>
-          </w:tcPr>
-          <w:p>
-            <w:pPr>
-              <w:spacing w:after="40"/>
-            </w:pPr>
+            <w:tcW w:type="dxa" w:w="4675"/>
+            <w:tcMar>
+              <w:top w:type="dxa" w:w="80"/>
+              <w:left w:type="dxa" w:w="100"/>
+              <w:bottom w:type="dxa" w:w="80"/>
+              <w:right w:type="dxa" w:w="100"/>
+            </w:tcMar>
+          </w:tcPr>
+          <w:p>
             <w:r>
               <w:t xml:space="preserve">Lockout</w:t>
             </w:r>
@@ -3255,24 +2936,17 @@
         </w:tc>
         <w:tc>
           <w:tcPr>
-            <w:tcW w:type="dxa" w:w="4680"/>
-          </w:tcPr>
-          <w:p>
-            <w:pPr>
-              <w:spacing w:after="40"/>
-            </w:pPr>
-            <w:r>
-              <w:t xml:space="preserve">15 minutes, Redis (</w:t>
-            </w:r>
-            <w:r>
-              <w:rPr>
-                <w:rFonts w:ascii="Consolas" w:cs="Consolas" w:eastAsia="Consolas" w:hAnsi="Consolas"/>
-                <w:shd w:fill="EFEFEF" w:val="clear"/>
-              </w:rPr>
-              <w:t xml:space="preserve">ztsaacm:mfa_lockout:{user_id}</w:t>
-            </w:r>
-            <w:r>
-              <w:t xml:space="preserve">), auto-expiring</w:t>
+            <w:tcW w:type="dxa" w:w="4675"/>
+            <w:tcMar>
+              <w:top w:type="dxa" w:w="80"/>
+              <w:left w:type="dxa" w:w="100"/>
+              <w:bottom w:type="dxa" w:w="80"/>
+              <w:right w:type="dxa" w:w="100"/>
+            </w:tcMar>
+          </w:tcPr>
+          <w:p>
+            <w:r>
+              <w:t xml:space="preserve">15 minutes, Redis (ztsaacm:mfa_lockout:{user_id}), auto-expiring</w:t>
             </w:r>
           </w:p>
         </w:tc>
@@ -3283,12 +2957,15 @@
         </w:trPr>
         <w:tc>
           <w:tcPr>
-            <w:tcW w:type="dxa" w:w="4680"/>
-          </w:tcPr>
-          <w:p>
-            <w:pPr>
-              <w:spacing w:after="40"/>
-            </w:pPr>
+            <w:tcW w:type="dxa" w:w="4675"/>
+            <w:tcMar>
+              <w:top w:type="dxa" w:w="80"/>
+              <w:left w:type="dxa" w:w="100"/>
+              <w:bottom w:type="dxa" w:w="80"/>
+              <w:right w:type="dxa" w:w="100"/>
+            </w:tcMar>
+          </w:tcPr>
+          <w:p>
             <w:r>
               <w:t xml:space="preserve">Failed-OTP tracking</w:t>
             </w:r>
@@ -3296,12 +2973,15 @@
         </w:tc>
         <w:tc>
           <w:tcPr>
-            <w:tcW w:type="dxa" w:w="4680"/>
-          </w:tcPr>
-          <w:p>
-            <w:pPr>
-              <w:spacing w:after="40"/>
-            </w:pPr>
+            <w:tcW w:type="dxa" w:w="4675"/>
+            <w:tcMar>
+              <w:top w:type="dxa" w:w="80"/>
+              <w:left w:type="dxa" w:w="100"/>
+              <w:bottom w:type="dxa" w:w="80"/>
+              <w:right w:type="dxa" w:w="100"/>
+            </w:tcMar>
+          </w:tcPr>
+          <w:p>
             <w:r>
               <w:t xml:space="preserve">Separate Redis counter from Module 5's password-failure counter</w:t>
             </w:r>
@@ -3314,12 +2994,15 @@
         </w:trPr>
         <w:tc>
           <w:tcPr>
-            <w:tcW w:type="dxa" w:w="4680"/>
-          </w:tcPr>
-          <w:p>
-            <w:pPr>
-              <w:spacing w:after="40"/>
-            </w:pPr>
+            <w:tcW w:type="dxa" w:w="4675"/>
+            <w:tcMar>
+              <w:top w:type="dxa" w:w="80"/>
+              <w:left w:type="dxa" w:w="100"/>
+              <w:bottom w:type="dxa" w:w="80"/>
+              <w:right w:type="dxa" w:w="100"/>
+            </w:tcMar>
+          </w:tcPr>
+          <w:p>
             <w:r>
               <w:t xml:space="preserve">HIGH risk (0–49)</w:t>
             </w:r>
@@ -3327,12 +3010,15 @@
         </w:tc>
         <w:tc>
           <w:tcPr>
-            <w:tcW w:type="dxa" w:w="4680"/>
-          </w:tcPr>
-          <w:p>
-            <w:pPr>
-              <w:spacing w:after="40"/>
-            </w:pPr>
+            <w:tcW w:type="dxa" w:w="4675"/>
+            <w:tcMar>
+              <w:top w:type="dxa" w:w="80"/>
+              <w:left w:type="dxa" w:w="100"/>
+              <w:bottom w:type="dxa" w:w="80"/>
+              <w:right w:type="dxa" w:w="100"/>
+            </w:tcMar>
+          </w:tcPr>
+          <w:p>
             <w:r>
               <w:t xml:space="preserve">Hard reject, no MFA offered, creates a Security Alert record</w:t>
             </w:r>
@@ -3345,12 +3031,15 @@
         </w:trPr>
         <w:tc>
           <w:tcPr>
-            <w:tcW w:type="dxa" w:w="4680"/>
-          </w:tcPr>
-          <w:p>
-            <w:pPr>
-              <w:spacing w:after="40"/>
-            </w:pPr>
+            <w:tcW w:type="dxa" w:w="4675"/>
+            <w:tcMar>
+              <w:top w:type="dxa" w:w="80"/>
+              <w:left w:type="dxa" w:w="100"/>
+              <w:bottom w:type="dxa" w:w="80"/>
+              <w:right w:type="dxa" w:w="100"/>
+            </w:tcMar>
+          </w:tcPr>
+          <w:p>
             <w:r>
               <w:t xml:space="preserve">API flow</w:t>
             </w:r>
@@ -3358,12 +3047,15 @@
         </w:tc>
         <w:tc>
           <w:tcPr>
-            <w:tcW w:type="dxa" w:w="4680"/>
-          </w:tcPr>
-          <w:p>
-            <w:pPr>
-              <w:spacing w:after="40"/>
-            </w:pPr>
+            <w:tcW w:type="dxa" w:w="4675"/>
+            <w:tcMar>
+              <w:top w:type="dxa" w:w="80"/>
+              <w:left w:type="dxa" w:w="100"/>
+              <w:bottom w:type="dxa" w:w="80"/>
+              <w:right w:type="dxa" w:w="100"/>
+            </w:tcMar>
+          </w:tcPr>
+          <w:p>
             <w:r>
               <w:t xml:space="preserve">Two-step: POST /auth/login → mfa_required + challenge token; POST /auth/mfa/verify → real JWT on success</w:t>
             </w:r>
@@ -3376,12 +3068,15 @@
         </w:trPr>
         <w:tc>
           <w:tcPr>
-            <w:tcW w:type="dxa" w:w="4680"/>
-          </w:tcPr>
-          <w:p>
-            <w:pPr>
-              <w:spacing w:after="40"/>
-            </w:pPr>
+            <w:tcW w:type="dxa" w:w="4675"/>
+            <w:tcMar>
+              <w:top w:type="dxa" w:w="80"/>
+              <w:left w:type="dxa" w:w="100"/>
+              <w:bottom w:type="dxa" w:w="80"/>
+              <w:right w:type="dxa" w:w="100"/>
+            </w:tcMar>
+          </w:tcPr>
+          <w:p>
             <w:r>
               <w:t xml:space="preserve">Module 7 constraint</w:t>
             </w:r>
@@ -3389,12 +3084,15 @@
         </w:tc>
         <w:tc>
           <w:tcPr>
-            <w:tcW w:type="dxa" w:w="4680"/>
-          </w:tcPr>
-          <w:p>
-            <w:pPr>
-              <w:spacing w:after="40"/>
-            </w:pPr>
+            <w:tcW w:type="dxa" w:w="4675"/>
+            <w:tcMar>
+              <w:top w:type="dxa" w:w="80"/>
+              <w:left w:type="dxa" w:w="100"/>
+              <w:bottom w:type="dxa" w:w="80"/>
+              <w:right w:type="dxa" w:w="100"/>
+            </w:tcMar>
+          </w:tcPr>
+          <w:p>
             <w:r>
               <w:t xml:space="preserve">Future continuous-verification challenges reuse this email mechanism — TOTP is not to be reintroduced</w:t>
             </w:r>
@@ -3404,7 +3102,7 @@
     </w:tbl>
     <w:p>
       <w:pPr>
-        <w:spacing w:after="200"/>
+        <w:spacing w:after="160"/>
       </w:pPr>
     </w:p>
     <w:p>
@@ -3427,7 +3125,7 @@
     <w:p>
       <w:pPr>
         <w:pStyle w:val="Heading2"/>
-        <w:spacing w:after="120" w:before="200"/>
+        <w:spacing w:after="160" w:before="320"/>
       </w:pPr>
       <w:r>
         <w:t xml:space="preserve">MODULE 5 — Trust Score Engine</w:t>
@@ -3486,7 +3184,7 @@
     <w:p>
       <w:pPr>
         <w:pStyle w:val="Heading2"/>
-        <w:spacing w:after="120" w:before="200"/>
+        <w:spacing w:after="160" w:before="320"/>
       </w:pPr>
       <w:r>
         <w:t xml:space="preserve">MODULE 6 — Adaptive MFA</w:t>
@@ -3511,7 +3209,7 @@
     <w:p>
       <w:pPr>
         <w:pStyle w:val="Heading2"/>
-        <w:spacing w:after="120" w:before="200"/>
+        <w:spacing w:after="160" w:before="320"/>
       </w:pPr>
       <w:r>
         <w:t xml:space="preserve">MODULE 7 — Continuous Trust Evaluation</w:t>
@@ -3523,6 +3221,21 @@
       </w:pPr>
       <w:r>
         <w:t xml:space="preserve">This module converts the initial/static Trust Score into a DYNAMIC Trust Score, recalculated during an active session in response to security-relevant events (VPN change, IP change, abnormal download, abnormal request rate, etc.), potentially re-triggering MFA or revoking the session/ACL. This is where behavioral/in-session factors belong — they are explicitly out of scope for Module 5's static score.</w:t>
+      </w:r>
+    </w:p>
+    <w:p>
+      <w:pPr>
+        <w:spacing w:after="160"/>
+      </w:pPr>
+      <w:r>
+        <w:rPr>
+          <w:b/>
+          <w:bCs/>
+        </w:rPr>
+        <w:t xml:space="preserve">Status update (2026-09-14): Module 7 is now built</w:t>
+      </w:r>
+      <w:r>
+        <w:t xml:space="preserve"> (score recompute, MFA re-trigger, revoke/ACL-removal, all live — see Project status.md section 16), plus two hardening passes on top of it (account-level risk lockout; two frontend live-update fixes — Project status.md sections 18-20). The one part of Module 7 that is still admin-driven rather than genuinely automatic is *what causes* an event to fire in the first place — see Section 18 below for the finalized design that closes this, confirmed 2026-09-14 and scheduled to be built next, before Module 8.</w:t>
       </w:r>
     </w:p>
     <w:p>
@@ -3652,7 +3365,22 @@
         <w:t xml:space="preserve">MODULE 7 — Continuous Trust Evaluation</w:t>
       </w:r>
       <w:r>
-        <w:t xml:space="preserve"> — continuous session monitoring, security event detection, dynamic trust score updates, risk recalculation, adaptive MFA re-triggering, dynamic access decisions, ACL revocation when risk becomes unacceptable.</w:t>
+        <w:t xml:space="preserve"> — continuous session monitoring, security event detection, dynamic trust score updates, risk recalculation, adaptive MFA re-triggering, dynamic access decisions, ACL revocation when risk becomes unacceptable. Built 2026-09-13; hardened 2026-09-13/14 (account-level risk lockout, live-update fixes).</w:t>
+      </w:r>
+    </w:p>
+    <w:p>
+      <w:pPr>
+        <w:spacing w:after="160"/>
+      </w:pPr>
+      <w:r>
+        <w:rPr>
+          <w:b/>
+          <w:bCs/>
+        </w:rPr>
+        <w:t xml:space="preserve">→ NEXT — Real Passive Network Detection (Module 7 hardening, finalized 2026-09-14, not yet built)</w:t>
+      </w:r>
+      <w:r>
+        <w:t xml:space="preserve"> — replaces admin-triggered events with genuine, automatically-detected ones for a real logged-in user's session. Confirmed to be built here, before Module 8, so the dashboard has real data from day one. Full design in Section 18.</w:t>
       </w:r>
     </w:p>
     <w:p>
@@ -3682,7 +3410,7 @@
         <w:t xml:space="preserve">MODULE 9 — Attack Simulation</w:t>
       </w:r>
       <w:r>
-        <w:t xml:space="preserve"> — controlled, backend-driven simulations: IP change, Approved VPN, Unknown VPN, unknown device, abnormal requests, large download, failed login attempts, session termination.</w:t>
+        <w:t xml:space="preserve"> — controlled, backend-driven simulations: IP change, Approved VPN, Unknown VPN, unknown device, abnormal requests, large download, failed login attempts, session termination. (Note: with the Section 18 hardening in place, the existing admin "Trigger" control and Module 9's polished simulation buttons both remain — they become the manual/testing path that sits alongside real automatic detection, not the only way events happen.)</w:t>
       </w:r>
     </w:p>
     <w:p>
@@ -3914,7 +3642,17 @@
         <w:spacing w:after="160"/>
       </w:pPr>
       <w:r>
-        <w:t xml:space="preserve">Follow this development sequence: Module 1 (Foundation) → Module 2 (Authentication) → Module 3 (Session Lifecycle) → Module 4 (Dynamic ACL) → BASE SYSTEM WORKING → Module 5 (Trust Score) → Module 6 (Adaptive MFA) → Module 7 (Continuous Trust Evaluation) → Module 8 (Dashboard) → Module 9 (Attack Simulation) → Module 10 (Testing).</w:t>
+        <w:t xml:space="preserve">Follow this development sequence: Module 1 (Foundation) → Module 2 (Authentication) → Module 3 (Session Lifecycle) → Module 4 (Dynamic ACL) → BASE SYSTEM WORKING → Module 5 (Trust Score) → Module 6 (Adaptive MFA) → Module 7 (Continuous Trust Evaluation) → </w:t>
+      </w:r>
+      <w:r>
+        <w:rPr>
+          <w:b/>
+          <w:bCs/>
+        </w:rPr>
+        <w:t xml:space="preserve">Real Passive Network Detection (Module 7 hardening — Section 18, confirmed 2026-09-14)</w:t>
+      </w:r>
+      <w:r>
+        <w:t xml:space="preserve"> → Module 8 (Dashboard) → Module 9 (Attack Simulation) → Module 10 (Testing).</w:t>
       </w:r>
     </w:p>
     <w:p>
@@ -3949,7 +3687,7 @@
           <w:ilvl w:val="0"/>
           <w:numId w:val="1"/>
         </w:numPr>
-        <w:spacing w:after="100"/>
+        <w:spacing w:after="120"/>
       </w:pPr>
       <w:r>
         <w:rPr>
@@ -3969,7 +3707,7 @@
           <w:ilvl w:val="0"/>
           <w:numId w:val="1"/>
         </w:numPr>
-        <w:spacing w:after="100"/>
+        <w:spacing w:after="120"/>
       </w:pPr>
       <w:r>
         <w:rPr>
@@ -3989,7 +3727,7 @@
           <w:ilvl w:val="0"/>
           <w:numId w:val="1"/>
         </w:numPr>
-        <w:spacing w:after="100"/>
+        <w:spacing w:after="120"/>
       </w:pPr>
       <w:r>
         <w:rPr>
@@ -4009,7 +3747,7 @@
           <w:ilvl w:val="0"/>
           <w:numId w:val="1"/>
         </w:numPr>
-        <w:spacing w:after="100"/>
+        <w:spacing w:after="120"/>
       </w:pPr>
       <w:r>
         <w:rPr>
@@ -4029,7 +3767,7 @@
           <w:ilvl w:val="0"/>
           <w:numId w:val="1"/>
         </w:numPr>
-        <w:spacing w:after="100"/>
+        <w:spacing w:after="120"/>
       </w:pPr>
       <w:r>
         <w:rPr>
@@ -4049,7 +3787,7 @@
           <w:ilvl w:val="0"/>
           <w:numId w:val="1"/>
         </w:numPr>
-        <w:spacing w:after="100"/>
+        <w:spacing w:after="120"/>
       </w:pPr>
       <w:r>
         <w:rPr>
@@ -4100,7 +3838,17 @@
         <w:spacing w:after="160"/>
       </w:pPr>
       <w:r>
-        <w:t xml:space="preserve">This should be the final "story" of the application.</w:t>
+        <w:t xml:space="preserve">This should be the final "story" of the application. </w:t>
+      </w:r>
+      <w:r>
+        <w:rPr>
+          <w:b/>
+          <w:bCs/>
+        </w:rPr>
+        <w:t xml:space="preserve">Update (2026-09-14):</w:t>
+      </w:r>
+      <w:r>
+        <w:t xml:space="preserve"> once Section 18 is built, the "Simulate Unknown VPN" / "Simulate Abnormal Download" steps above can equally happen for real — the developer actually switching networks, using a real VPN, or generating real request volume — with the admin's simulate buttons remaining available as the manual/demo alternative to the same real pipeline.</w:t>
       </w:r>
     </w:p>
     <w:p>
@@ -4127,7 +3875,7 @@
           <w:ilvl w:val="0"/>
           <w:numId w:val="1"/>
         </w:numPr>
-        <w:spacing w:after="100"/>
+        <w:spacing w:after="120"/>
       </w:pPr>
       <w:r>
         <w:t xml:space="preserve">Build only a static dashboard with fake data.</w:t>
@@ -4140,7 +3888,7 @@
           <w:ilvl w:val="0"/>
           <w:numId w:val="1"/>
         </w:numPr>
-        <w:spacing w:after="100"/>
+        <w:spacing w:after="120"/>
       </w:pPr>
       <w:r>
         <w:t xml:space="preserve">Hard-code trust-score changes only in the frontend.</w:t>
@@ -4153,7 +3901,7 @@
           <w:ilvl w:val="0"/>
           <w:numId w:val="1"/>
         </w:numPr>
-        <w:spacing w:after="100"/>
+        <w:spacing w:after="120"/>
       </w:pPr>
       <w:r>
         <w:t xml:space="preserve">Fake ACL changes.</w:t>
@@ -4166,7 +3914,7 @@
           <w:ilvl w:val="0"/>
           <w:numId w:val="1"/>
         </w:numPr>
-        <w:spacing w:after="100"/>
+        <w:spacing w:after="120"/>
       </w:pPr>
       <w:r>
         <w:t xml:space="preserve">Fake WebSocket status.</w:t>
@@ -4179,7 +3927,7 @@
           <w:ilvl w:val="0"/>
           <w:numId w:val="1"/>
         </w:numPr>
-        <w:spacing w:after="100"/>
+        <w:spacing w:after="120"/>
       </w:pPr>
       <w:r>
         <w:t xml:space="preserve">Add AI just for the sake of saying "AI".</w:t>
@@ -4192,7 +3940,7 @@
           <w:ilvl w:val="0"/>
           <w:numId w:val="1"/>
         </w:numPr>
-        <w:spacing w:after="100"/>
+        <w:spacing w:after="120"/>
       </w:pPr>
       <w:r>
         <w:t xml:space="preserve">Start with complicated Kubernetes/eBPF infrastructure.</w:t>
@@ -4205,7 +3953,7 @@
           <w:ilvl w:val="0"/>
           <w:numId w:val="1"/>
         </w:numPr>
-        <w:spacing w:after="100"/>
+        <w:spacing w:after="120"/>
       </w:pPr>
       <w:r>
         <w:t xml:space="preserve">Build everything at once.</w:t>
@@ -4218,7 +3966,7 @@
           <w:ilvl w:val="0"/>
           <w:numId w:val="1"/>
         </w:numPr>
-        <w:spacing w:after="100"/>
+        <w:spacing w:after="120"/>
       </w:pPr>
       <w:r>
         <w:t xml:space="preserve">Mix frontend and backend responsibilities unnecessarily.</w:t>
@@ -4231,7 +3979,7 @@
           <w:ilvl w:val="0"/>
           <w:numId w:val="1"/>
         </w:numPr>
-        <w:spacing w:after="100"/>
+        <w:spacing w:after="120"/>
       </w:pPr>
       <w:r>
         <w:t xml:space="preserve">Claim the base-paper features as our original contribution.</w:t>
@@ -4244,7 +3992,7 @@
           <w:ilvl w:val="0"/>
           <w:numId w:val="1"/>
         </w:numPr>
-        <w:spacing w:after="100"/>
+        <w:spacing w:after="120"/>
       </w:pPr>
       <w:r>
         <w:t xml:space="preserve">Focus on research-paper writing yet.</w:t>
@@ -4282,7 +4030,7 @@
           <w:ilvl w:val="0"/>
           <w:numId w:val="1"/>
         </w:numPr>
-        <w:spacing w:after="100"/>
+        <w:spacing w:after="120"/>
       </w:pPr>
       <w:r>
         <w:t xml:space="preserve">First identify which module the requested work belongs to.</w:t>
@@ -4295,7 +4043,7 @@
           <w:ilvl w:val="0"/>
           <w:numId w:val="1"/>
         </w:numPr>
-        <w:spacing w:after="100"/>
+        <w:spacing w:after="120"/>
       </w:pPr>
       <w:r>
         <w:t xml:space="preserve">Check dependencies on previously completed modules.</w:t>
@@ -4308,7 +4056,7 @@
           <w:ilvl w:val="0"/>
           <w:numId w:val="1"/>
         </w:numPr>
-        <w:spacing w:after="100"/>
+        <w:spacing w:after="120"/>
       </w:pPr>
       <w:r>
         <w:t xml:space="preserve">Do not redesign the entire architecture unnecessarily.</w:t>
@@ -4321,7 +4069,7 @@
           <w:ilvl w:val="0"/>
           <w:numId w:val="1"/>
         </w:numPr>
-        <w:spacing w:after="100"/>
+        <w:spacing w:after="120"/>
       </w:pPr>
       <w:r>
         <w:t xml:space="preserve">Give implementation steps in the correct order.</w:t>
@@ -4334,7 +4082,7 @@
           <w:ilvl w:val="0"/>
           <w:numId w:val="1"/>
         </w:numPr>
-        <w:spacing w:after="100"/>
+        <w:spacing w:after="120"/>
       </w:pPr>
       <w:r>
         <w:t xml:space="preserve">Provide complete, runnable code when I ask for implementation.</w:t>
@@ -4347,7 +4095,7 @@
           <w:ilvl w:val="0"/>
           <w:numId w:val="1"/>
         </w:numPr>
-        <w:spacing w:after="100"/>
+        <w:spacing w:after="120"/>
       </w:pPr>
       <w:r>
         <w:t xml:space="preserve">Clearly mention which files need to be created or modified.</w:t>
@@ -4360,7 +4108,7 @@
           <w:ilvl w:val="0"/>
           <w:numId w:val="1"/>
         </w:numPr>
-        <w:spacing w:after="100"/>
+        <w:spacing w:after="120"/>
       </w:pPr>
       <w:r>
         <w:t xml:space="preserve">Explain where each piece of code belongs.</w:t>
@@ -4373,7 +4121,7 @@
           <w:ilvl w:val="0"/>
           <w:numId w:val="1"/>
         </w:numPr>
-        <w:spacing w:after="100"/>
+        <w:spacing w:after="120"/>
       </w:pPr>
       <w:r>
         <w:t xml:space="preserve">Keep the code modular and maintainable.</w:t>
@@ -4386,7 +4134,7 @@
           <w:ilvl w:val="0"/>
           <w:numId w:val="1"/>
         </w:numPr>
-        <w:spacing w:after="100"/>
+        <w:spacing w:after="120"/>
       </w:pPr>
       <w:r>
         <w:t xml:space="preserve">Avoid unnecessary technologies.</w:t>
@@ -4399,7 +4147,7 @@
           <w:ilvl w:val="0"/>
           <w:numId w:val="1"/>
         </w:numPr>
-        <w:spacing w:after="100"/>
+        <w:spacing w:after="120"/>
       </w:pPr>
       <w:r>
         <w:t xml:space="preserve">Make sure frontend and backend remain compatible.</w:t>
@@ -4412,7 +4160,7 @@
           <w:ilvl w:val="0"/>
           <w:numId w:val="1"/>
         </w:numPr>
-        <w:spacing w:after="100"/>
+        <w:spacing w:after="120"/>
       </w:pPr>
       <w:r>
         <w:t xml:space="preserve">Consider security best practices.</w:t>
@@ -4425,7 +4173,7 @@
           <w:ilvl w:val="0"/>
           <w:numId w:val="1"/>
         </w:numPr>
-        <w:spacing w:after="100"/>
+        <w:spacing w:after="120"/>
       </w:pPr>
       <w:r>
         <w:t xml:space="preserve">Do not skip integration/testing steps.</w:t>
@@ -4438,7 +4186,7 @@
           <w:ilvl w:val="0"/>
           <w:numId w:val="1"/>
         </w:numPr>
-        <w:spacing w:after="100"/>
+        <w:spacing w:after="120"/>
       </w:pPr>
       <w:r>
         <w:t xml:space="preserve">If there are multiple technically valid approaches, recommend the simplest reliable approach suitable for a 4th-year student project.</w:t>
@@ -4451,7 +4199,7 @@
           <w:ilvl w:val="0"/>
           <w:numId w:val="1"/>
         </w:numPr>
-        <w:spacing w:after="100"/>
+        <w:spacing w:after="120"/>
       </w:pPr>
       <w:r>
         <w:t xml:space="preserve">Do not assume enterprise infrastructure that we cannot realistically deploy.</w:t>
@@ -4464,7 +4212,7 @@
           <w:ilvl w:val="0"/>
           <w:numId w:val="1"/>
         </w:numPr>
-        <w:spacing w:after="100"/>
+        <w:spacing w:after="120"/>
       </w:pPr>
       <w:r>
         <w:t xml:space="preserve">Before implementing a major architectural change, explain why it is necessary.</w:t>
@@ -4508,31 +4256,51 @@
         <w:spacing w:after="160"/>
       </w:pPr>
       <w:r>
-        <w:t xml:space="preserve">Modules 1–5 are complete, independently verified, and live-tested (see Project_status.md for the full verification and fix-log history — the base-paper flow, Modules 1–4, plus Module 5's Trust Score Engine, are genuinely implemented, not just designed). Module 6 (Adaptive MFA) is now implemented too, using the email-one-time-code design in Section 7 (revised 2026-09-10, TOTP removed) — see Project status.md section 11 for the implementation and verification record. Module 7 (Continuous Trust Evaluation) has not been started.</w:t>
-      </w:r>
-    </w:p>
-    <w:p>
-      <w:pPr>
-        <w:spacing w:after="160"/>
-      </w:pPr>
-      <w:r>
-        <w:t xml:space="preserve">Then implement: Adaptive MFA → Continuous Trust Evaluation.</w:t>
-      </w:r>
-    </w:p>
-    <w:p>
-      <w:pPr>
-        <w:spacing w:after="160"/>
-      </w:pPr>
-      <w:r>
-        <w:t xml:space="preserve">Then integrate everything into the dashboard.</w:t>
-      </w:r>
-    </w:p>
-    <w:p>
-      <w:pPr>
-        <w:spacing w:after="160"/>
-      </w:pPr>
-      <w:r>
-        <w:t xml:space="preserve">Then test and evaluate the complete system.</w:t>
+        <w:rPr>
+          <w:b/>
+          <w:bCs/>
+        </w:rPr>
+        <w:t xml:space="preserve">Status update (2026-09-14):</w:t>
+      </w:r>
+      <w:r>
+        <w:t xml:space="preserve"> Modules 1–7 are complete, independently verified, and live-tested (see </w:t>
+      </w:r>
+      <w:r>
+        <w:rPr>
+          <w:rFonts w:ascii="Consolas" w:cs="Consolas" w:eastAsia="Consolas" w:hAnsi="Consolas"/>
+          <w:sz w:val="20"/>
+          <w:szCs w:val="20"/>
+        </w:rPr>
+        <w:t xml:space="preserve">Project status.md</w:t>
+      </w:r>
+      <w:r>
+        <w:t xml:space="preserve"> for the full verification and fix-log history) — the base-paper flow, Modules 1–4, Module 5's Trust Score Engine, Module 6's Adaptive MFA (email-one-time-code design, Section 7), and Module 7's Continuous Trust Evaluation are all genuinely implemented, not just designed, plus two Module 7 hardening passes (account-level risk lockout; two frontend live-score-display fixes — </w:t>
+      </w:r>
+      <w:r>
+        <w:rPr>
+          <w:rFonts w:ascii="Consolas" w:cs="Consolas" w:eastAsia="Consolas" w:hAnsi="Consolas"/>
+          <w:sz w:val="20"/>
+          <w:szCs w:val="20"/>
+        </w:rPr>
+        <w:t xml:space="preserve">Project status.md</w:t>
+      </w:r>
+      <w:r>
+        <w:t xml:space="preserve"> sections 18–20).</w:t>
+      </w:r>
+    </w:p>
+    <w:p>
+      <w:pPr>
+        <w:spacing w:after="160"/>
+      </w:pPr>
+      <w:r>
+        <w:rPr>
+          <w:b/>
+          <w:bCs/>
+        </w:rPr>
+        <w:t xml:space="preserve">Next up, confirmed 2026-09-14, before Module 8:</w:t>
+      </w:r>
+      <w:r>
+        <w:t xml:space="preserve"> the Real Passive Network Detection hardening pass specified in Section 18 below — replacing today's admin-triggered Module 7 events with genuine automatic detection off real user traffic. Modules 8, 9, and 10 have not been started.</w:t>
       </w:r>
     </w:p>
     <w:p>
@@ -4560,11 +4328,860 @@
         <w:spacing w:after="160"/>
       </w:pPr>
       <w:r>
-        <w:t xml:space="preserve">Treat everything above as the permanent project context for this conversation. Section 6 (Trust Score Concept) is finalized and approved. Section 7 (Adaptive MFA Concept) was finalized as a TOTP-hybrid design and has since been revised (2026-09-10) at the developer's explicit request to an email-one-time-code-only design, with TOTP removed from both login MFA and any future Module 7 continuous-verification mechanism — do not reintroduce TOTP without a new explicit request. Before beginning Module 7 implementation, confirm you are working from this revised version, and confirm you have read Project_status.md for the actual current state of the codebase (what's really built and tested, not just planned).</w:t>
+        <w:t xml:space="preserve">Treat everything above as the permanent project context for this conversation. Section 6 (Trust Score Concept) is finalized and approved. Section 7 (Adaptive MFA Concept) was finalized as a TOTP-hybrid design and has since been revised (2026-09-10) at the developer's explicit request to an email-one-time-code-only design, with TOTP removed from both login MFA and any future Module 7 continuous-verification mechanism — do not reintroduce TOTP without a new explicit request. Section 18 (Real Passive Network Detection) is finalized (2026-09-14) and is the next work item, before Module 8 — treat it with the same authority as Sections 6 and 7 above. Before beginning any further implementation, confirm you have read </w:t>
+      </w:r>
+      <w:r>
+        <w:rPr>
+          <w:rFonts w:ascii="Consolas" w:cs="Consolas" w:eastAsia="Consolas" w:hAnsi="Consolas"/>
+          <w:sz w:val="20"/>
+          <w:szCs w:val="20"/>
+        </w:rPr>
+        <w:t xml:space="preserve">Project status.md</w:t>
+      </w:r>
+      <w:r>
+        <w:t xml:space="preserve"> for the actual current state of the codebase (what's really built and tested, not just planned).</w:t>
+      </w:r>
+    </w:p>
+    <w:p>
+      <w:pPr>
+        <w:pStyle w:val="Heading1"/>
+        <w:spacing w:after="160" w:before="320"/>
+      </w:pPr>
+      <w:r>
+        <w:t xml:space="preserve">18. REAL PASSIVE NETWORK DETECTION — Module 7 hardening (FINALIZED 2026-09-14, not yet implemented)</w:t>
+      </w:r>
+    </w:p>
+    <w:p>
+      <w:pPr>
+        <w:spacing w:after="160"/>
+      </w:pPr>
+      <w:r>
+        <w:rPr>
+          <w:b/>
+          <w:bCs/>
+        </w:rPr>
+        <w:t xml:space="preserve">Status: FINALIZED, all open questions resolved 2026-09-14. Nothing described here exists in code yet.</w:t>
+      </w:r>
+      <w:r>
+        <w:t xml:space="preserve"> Confirmed to be built next, before Module 8. When implemented, this section should be marked as superseded by a "Post-Module-7 Hardening" writeup in </w:t>
+      </w:r>
+      <w:r>
+        <w:rPr>
+          <w:rFonts w:ascii="Consolas" w:cs="Consolas" w:eastAsia="Consolas" w:hAnsi="Consolas"/>
+          <w:sz w:val="20"/>
+          <w:szCs w:val="20"/>
+        </w:rPr>
+        <w:t xml:space="preserve">Project status.md</w:t>
+      </w:r>
+      <w:r>
+        <w:t xml:space="preserve">, the same pattern already used for the account-level risk lockout (</w:t>
+      </w:r>
+      <w:r>
+        <w:rPr>
+          <w:rFonts w:ascii="Consolas" w:cs="Consolas" w:eastAsia="Consolas" w:hAnsi="Consolas"/>
+          <w:sz w:val="20"/>
+          <w:szCs w:val="20"/>
+        </w:rPr>
+        <w:t xml:space="preserve">Project status.md</w:t>
+      </w:r>
+      <w:r>
+        <w:t xml:space="preserve"> section 18) and the two live-score-display fixes (sections 19–20).</w:t>
+      </w:r>
+    </w:p>
+    <w:p>
+      <w:pPr>
+        <w:pStyle w:val="Heading2"/>
+        <w:spacing w:after="160" w:before="320"/>
+      </w:pPr>
+      <w:r>
+        <w:t xml:space="preserve">Problem this closes</w:t>
+      </w:r>
+    </w:p>
+    <w:p>
+      <w:pPr>
+        <w:spacing w:after="160"/>
+      </w:pPr>
+      <w:r>
+        <w:t xml:space="preserve">Module 7 (Section 8 above) is real end-to-end *once an event exists*: the score recompute, the MFA re-trigger, and the revoke/ACL-removal all run through genuine backend logic. But today, the event itself only ever gets created one way — an admin manually calling </w:t>
+      </w:r>
+      <w:r>
+        <w:rPr>
+          <w:rFonts w:ascii="Consolas" w:cs="Consolas" w:eastAsia="Consolas" w:hAnsi="Consolas"/>
+          <w:sz w:val="20"/>
+          <w:szCs w:val="20"/>
+        </w:rPr>
+        <w:t xml:space="preserve">POST /security/events</w:t>
+      </w:r>
+      <w:r>
+        <w:t xml:space="preserve"> (surfaced as the "Trigger" control on the Live Sessions page). Nothing passively watches a real user's own session and notices, on its own, that their real IP changed, their real device is different, they're really on a VPN, or their real request volume spiked. A real end user doing something risky mid-session currently produces no event on its own — only an admin clicking a dropdown does. This closes that gap: genuine user network/device activity should drive the Trust Score, Adaptive MFA, and session termination directly, matching Section 3's own framing ("our system will continuously evaluate the user's trust/risk during the session") and Section 5's Security Alerts description, neither of which was ever meant to require a human in the loop.</w:t>
+      </w:r>
+    </w:p>
+    <w:p>
+      <w:pPr>
+        <w:pStyle w:val="Heading2"/>
+        <w:spacing w:after="160" w:before="320"/>
+      </w:pPr>
+      <w:r>
+        <w:t xml:space="preserve">Confirmed scope — which factors become real</w:t>
+      </w:r>
+    </w:p>
+    <w:p>
+      <w:pPr>
+        <w:pStyle w:val="ListParagraph"/>
+        <w:numPr>
+          <w:ilvl w:val="0"/>
+          <w:numId w:val="1"/>
+        </w:numPr>
+        <w:spacing w:after="120"/>
+      </w:pPr>
+      <w:r>
+        <w:rPr>
+          <w:b/>
+          <w:bCs/>
+        </w:rPr>
+        <w:t xml:space="preserve">IP change</w:t>
+      </w:r>
+      <w:r>
+        <w:t xml:space="preserve"> — real, via the mechanism below.</w:t>
+      </w:r>
+    </w:p>
+    <w:p>
+      <w:pPr>
+        <w:pStyle w:val="ListParagraph"/>
+        <w:numPr>
+          <w:ilvl w:val="0"/>
+          <w:numId w:val="1"/>
+        </w:numPr>
+        <w:spacing w:after="120"/>
+      </w:pPr>
+      <w:r>
+        <w:rPr>
+          <w:b/>
+          <w:bCs/>
+        </w:rPr>
+        <w:t xml:space="preserve">Device / User-Agent change</w:t>
+      </w:r>
+      <w:r>
+        <w:t xml:space="preserve"> — real, via the mechanism below.</w:t>
+      </w:r>
+    </w:p>
+    <w:p>
+      <w:pPr>
+        <w:pStyle w:val="ListParagraph"/>
+        <w:numPr>
+          <w:ilvl w:val="0"/>
+          <w:numId w:val="1"/>
+        </w:numPr>
+        <w:spacing w:after="120"/>
+      </w:pPr>
+      <w:r>
+        <w:rPr>
+          <w:b/>
+          <w:bCs/>
+        </w:rPr>
+        <w:t xml:space="preserve">VPN detected</w:t>
+      </w:r>
+      <w:r>
+        <w:t xml:space="preserve"> — real; reuses Module 5's existing approved/known-bad CIDR classification (Section 6) unchanged, fed a real IP instead of an admin-typed one. The CIDR lists themselves remain configurable per-organization (already true today via </w:t>
+      </w:r>
+      <w:r>
+        <w:rPr>
+          <w:rFonts w:ascii="Consolas" w:cs="Consolas" w:eastAsia="Consolas" w:hAnsi="Consolas"/>
+          <w:sz w:val="20"/>
+          <w:szCs w:val="20"/>
+        </w:rPr>
+        <w:t xml:space="preserve">.env</w:t>
+      </w:r>
+      <w:r>
+        <w:t xml:space="preserve">) — for demo/testing, the confirmed approach is standing up one small self-hosted VPN (e.g. a cheap VPS running WireGuard) with a fixed, known IP, and adding that exact IP/CIDR to the approved and/or known-bad list, rather than trying to match an unpredictable commercial VPN provider's real (large, rotating) IP ranges.</w:t>
+      </w:r>
+    </w:p>
+    <w:p>
+      <w:pPr>
+        <w:pStyle w:val="ListParagraph"/>
+        <w:numPr>
+          <w:ilvl w:val="0"/>
+          <w:numId w:val="1"/>
+        </w:numPr>
+        <w:spacing w:after="120"/>
+      </w:pPr>
+      <w:r>
+        <w:rPr>
+          <w:b/>
+          <w:bCs/>
+        </w:rPr>
+        <w:t xml:space="preserve">Abnormal request rate</w:t>
+      </w:r>
+      <w:r>
+        <w:t xml:space="preserve"> — real; a rolling count of real authenticated calls from a session in a short window, independent of the heartbeat's own fixed cadence (see mechanism below), crossing a configured threshold.</w:t>
+      </w:r>
+    </w:p>
+    <w:p>
+      <w:pPr>
+        <w:pStyle w:val="ListParagraph"/>
+        <w:numPr>
+          <w:ilvl w:val="0"/>
+          <w:numId w:val="1"/>
+        </w:numPr>
+        <w:spacing w:after="120"/>
+      </w:pPr>
+      <w:r>
+        <w:rPr>
+          <w:b/>
+          <w:bCs/>
+        </w:rPr>
+        <w:t xml:space="preserve">Large download — deliberately OUT of scope, unchanged.</w:t>
+      </w:r>
+      <w:r>
+        <w:t xml:space="preserve"> There is no real protected-resource download endpoint in the app to measure a real transfer size against, so there is nothing genuine to observe. Stays admin-simulate-only. Revisit only if a real dummy download endpoint is explicitly added later.</w:t>
+      </w:r>
+    </w:p>
+    <w:p>
+      <w:pPr>
+        <w:pStyle w:val="ListParagraph"/>
+        <w:numPr>
+          <w:ilvl w:val="0"/>
+          <w:numId w:val="1"/>
+        </w:numPr>
+        <w:spacing w:after="120"/>
+      </w:pPr>
+      <w:r>
+        <w:rPr>
+          <w:b/>
+          <w:bCs/>
+        </w:rPr>
+        <w:t xml:space="preserve">Multiple failed logins — deliberately OUT of scope for this pass, unchanged.</w:t>
+      </w:r>
+      <w:r>
+        <w:t xml:space="preserve"> This already has a real, live Redis counter (Module 5), but it currently only affects the *next* login's score, not an already-open session's live score. Making it also react against an open session is a different kind of signal (account-wide, not connection-specific) and is left for a possible future pass, not bundled into this one.</w:t>
+      </w:r>
+    </w:p>
+    <w:p>
+      <w:pPr>
+        <w:pStyle w:val="Heading2"/>
+        <w:spacing w:after="160" w:before="320"/>
+      </w:pPr>
+      <w:r>
+        <w:t xml:space="preserve">Mechanism — a second, independent channel (not the WebSocket)</w:t>
+      </w:r>
+    </w:p>
+    <w:p>
+      <w:pPr>
+        <w:spacing w:after="160"/>
+      </w:pPr>
+      <w:r>
+        <w:rPr>
+          <w:b/>
+          <w:bCs/>
+        </w:rPr>
+        <w:t xml:space="preserve">Why not the WebSocket:</w:t>
+      </w:r>
+      <w:r>
+        <w:t xml:space="preserve"> the session IS the WebSocket connection (Module 3) — its </w:t>
+      </w:r>
+      <w:r>
+        <w:rPr>
+          <w:rFonts w:ascii="Consolas" w:cs="Consolas" w:eastAsia="Consolas" w:hAnsi="Consolas"/>
+          <w:sz w:val="20"/>
+          <w:szCs w:val="20"/>
+        </w:rPr>
+        <w:t xml:space="preserve">onopen</w:t>
+      </w:r>
+      <w:r>
+        <w:t xml:space="preserve"> creates the session, its </w:t>
+      </w:r>
+      <w:r>
+        <w:rPr>
+          <w:rFonts w:ascii="Consolas" w:cs="Consolas" w:eastAsia="Consolas" w:hAnsi="Consolas"/>
+          <w:sz w:val="20"/>
+          <w:szCs w:val="20"/>
+        </w:rPr>
+        <w:t xml:space="preserve">onclose</w:t>
+      </w:r>
+      <w:r>
+        <w:t xml:space="preserve"> ends it, and the real IP/User-Agent are read exactly once, at that socket's handshake, and cannot change again on that same connection without the connection itself dropping (which, per today's frontend reconnect logic, would open a brand-new session, not update the existing one). So the WS connection itself cannot be the source of a genuine mid-session IP/device change signal.</w:t>
+      </w:r>
+    </w:p>
+    <w:p>
+      <w:pPr>
+        <w:spacing w:after="160"/>
+      </w:pPr>
+      <w:r>
+        <w:rPr>
+          <w:b/>
+          <w:bCs/>
+        </w:rPr>
+        <w:t xml:space="preserve">Confirmed mechanism:</w:t>
+      </w:r>
+      <w:r>
+        <w:t xml:space="preserve"> the frontend adds a small periodic authenticated HTTP call — a heartbeat — separate from the WebSocket's own ping, made roughly every 20 seconds while a session is open (default; env-configurable, not hardcoded, consistent with this project's existing convention for all timing values). Every such HTTP request naturally carries the browser's real, current IP and User-Agent at the moment it arrives, regardless of what the long-lived WS connection's own fixed IP is. This is purely additive — Module 3's session/WS lifecycle is untouched.</w:t>
+      </w:r>
+    </w:p>
+    <w:p>
+      <w:pPr>
+        <w:pStyle w:val="Heading2"/>
+        <w:spacing w:after="160" w:before="320"/>
+      </w:pPr>
+      <w:r>
+        <w:t xml:space="preserve">Comparison logic — "last observed," not the login baseline</w:t>
+      </w:r>
+    </w:p>
+    <w:p>
+      <w:pPr>
+        <w:spacing w:after="160"/>
+      </w:pPr>
+      <w:r>
+        <w:t xml:space="preserve">The session's original login-time baseline (</w:t>
+      </w:r>
+      <w:r>
+        <w:rPr>
+          <w:rFonts w:ascii="Consolas" w:cs="Consolas" w:eastAsia="Consolas" w:hAnsi="Consolas"/>
+          <w:sz w:val="20"/>
+          <w:szCs w:val="20"/>
+        </w:rPr>
+        <w:t xml:space="preserve">sessions.ip_address</w:t>
+      </w:r>
+      <w:r>
+        <w:t xml:space="preserve"> / </w:t>
+      </w:r>
+      <w:r>
+        <w:rPr>
+          <w:rFonts w:ascii="Consolas" w:cs="Consolas" w:eastAsia="Consolas" w:hAnsi="Consolas"/>
+          <w:sz w:val="20"/>
+          <w:szCs w:val="20"/>
+        </w:rPr>
+        <w:t xml:space="preserve">sessions.user_agent</w:t>
+      </w:r>
+      <w:r>
+        <w:t xml:space="preserve">, set once at WS handshake) is </w:t>
+      </w:r>
+      <w:r>
+        <w:rPr>
+          <w:b/>
+          <w:bCs/>
+        </w:rPr>
+        <w:t xml:space="preserve">never modified</w:t>
+      </w:r>
+      <w:r>
+        <w:t xml:space="preserve"> by this mechanism — it stays exactly as Module 5 already uses it.</w:t>
+      </w:r>
+    </w:p>
+    <w:p>
+      <w:pPr>
+        <w:spacing w:after="160"/>
+      </w:pPr>
+      <w:r>
+        <w:t xml:space="preserve">A new, separate, mutable piece of state is introduced per active session — "last observed at the previous heartbeat" (IP + User-Agent). Confirmed design:</w:t>
+      </w:r>
+    </w:p>
+    <w:p>
+      <w:pPr>
+        <w:pStyle w:val="ListParagraph"/>
+        <w:numPr>
+          <w:ilvl w:val="0"/>
+          <w:numId w:val="1"/>
+        </w:numPr>
+        <w:spacing w:after="120"/>
+      </w:pPr>
+      <w:r>
+        <w:t xml:space="preserve">The </w:t>
+      </w:r>
+      <w:r>
+        <w:rPr>
+          <w:b/>
+          <w:bCs/>
+        </w:rPr>
+        <w:t xml:space="preserve">first</w:t>
+      </w:r>
+      <w:r>
+        <w:t xml:space="preserve"> heartbeat of a session silently seeds this state from its own real IP/UA and fires </w:t>
+      </w:r>
+      <w:r>
+        <w:rPr>
+          <w:b/>
+          <w:bCs/>
+        </w:rPr>
+        <w:t xml:space="preserve">no</w:t>
+      </w:r>
+      <w:r>
+        <w:t xml:space="preserve"> event (it is simply confirming what the login baseline already established in the common case).</w:t>
+      </w:r>
+    </w:p>
+    <w:p>
+      <w:pPr>
+        <w:pStyle w:val="ListParagraph"/>
+        <w:numPr>
+          <w:ilvl w:val="0"/>
+          <w:numId w:val="1"/>
+        </w:numPr>
+        <w:spacing w:after="120"/>
+      </w:pPr>
+      <w:r>
+        <w:t xml:space="preserve">Every </w:t>
+      </w:r>
+      <w:r>
+        <w:rPr>
+          <w:b/>
+          <w:bCs/>
+        </w:rPr>
+        <w:t xml:space="preserve">subsequent</w:t>
+      </w:r>
+      <w:r>
+        <w:t xml:space="preserve"> heartbeat compares its real IP/UA against the </w:t>
+      </w:r>
+      <w:r>
+        <w:rPr>
+          <w:b/>
+          <w:bCs/>
+        </w:rPr>
+        <w:t xml:space="preserve">last-observed</w:t>
+      </w:r>
+      <w:r>
+        <w:t xml:space="preserve"> value (not the original login baseline). A genuine difference fires the matching event (</w:t>
+      </w:r>
+      <w:r>
+        <w:rPr>
+          <w:rFonts w:ascii="Consolas" w:cs="Consolas" w:eastAsia="Consolas" w:hAnsi="Consolas"/>
+          <w:sz w:val="20"/>
+          <w:szCs w:val="20"/>
+        </w:rPr>
+        <w:t xml:space="preserve">ip_change</w:t>
+      </w:r>
+      <w:r>
+        <w:t xml:space="preserve"> / </w:t>
+      </w:r>
+      <w:r>
+        <w:rPr>
+          <w:rFonts w:ascii="Consolas" w:cs="Consolas" w:eastAsia="Consolas" w:hAnsi="Consolas"/>
+          <w:sz w:val="20"/>
+          <w:szCs w:val="20"/>
+        </w:rPr>
+        <w:t xml:space="preserve">unknown_device</w:t>
+      </w:r>
+      <w:r>
+        <w:t xml:space="preserve"> / </w:t>
+      </w:r>
+      <w:r>
+        <w:rPr>
+          <w:rFonts w:ascii="Consolas" w:cs="Consolas" w:eastAsia="Consolas" w:hAnsi="Consolas"/>
+          <w:sz w:val="20"/>
+          <w:szCs w:val="20"/>
+        </w:rPr>
+        <w:t xml:space="preserve">vpn_detected</w:t>
+      </w:r>
+      <w:r>
+        <w:t xml:space="preserve"> as applicable) through the existing, unchanged </w:t>
+      </w:r>
+      <w:r>
+        <w:rPr>
+          <w:rFonts w:ascii="Consolas" w:cs="Consolas" w:eastAsia="Consolas" w:hAnsi="Consolas"/>
+          <w:sz w:val="20"/>
+          <w:szCs w:val="20"/>
+        </w:rPr>
+        <w:t xml:space="preserve">continuous.record_event()</w:t>
+      </w:r>
+      <w:r>
+        <w:t xml:space="preserve"> pipeline, then updates the last-observed value to the new one.</w:t>
+      </w:r>
+    </w:p>
+    <w:p>
+      <w:pPr>
+        <w:pStyle w:val="ListParagraph"/>
+        <w:numPr>
+          <w:ilvl w:val="0"/>
+          <w:numId w:val="1"/>
+        </w:numPr>
+        <w:spacing w:after="120"/>
+      </w:pPr>
+      <w:r>
+        <w:t xml:space="preserve">This means an event fires once per actual change, not once per poll — a user who stays on a newly-flagged IP does not keep re-triggering the same event every heartbeat forever.</w:t>
+      </w:r>
+    </w:p>
+    <w:p>
+      <w:pPr>
+        <w:pStyle w:val="ListParagraph"/>
+        <w:numPr>
+          <w:ilvl w:val="0"/>
+          <w:numId w:val="1"/>
+        </w:numPr>
+        <w:spacing w:after="120"/>
+      </w:pPr>
+      <w:r>
+        <w:t xml:space="preserve">This "last observed" state is cleared when the session ends (mirrors the existing pattern already used for other session-scoped Redis state, e.g. ACL ref-counts).</w:t>
+      </w:r>
+    </w:p>
+    <w:p>
+      <w:pPr>
+        <w:pStyle w:val="Heading2"/>
+        <w:spacing w:after="160" w:before="320"/>
+      </w:pPr>
+      <w:r>
+        <w:t xml:space="preserve">Admin "Trigger" control — kept, unchanged in behavior</w:t>
+      </w:r>
+    </w:p>
+    <w:p>
+      <w:pPr>
+        <w:spacing w:after="160"/>
+      </w:pPr>
+      <w:r>
+        <w:rPr>
+          <w:rFonts w:ascii="Consolas" w:cs="Consolas" w:eastAsia="Consolas" w:hAnsi="Consolas"/>
+          <w:sz w:val="20"/>
+          <w:szCs w:val="20"/>
+        </w:rPr>
+        <w:t xml:space="preserve">POST /security/events</w:t>
+      </w:r>
+      <w:r>
+        <w:t xml:space="preserve"> and the Live Sessions "Trigger" dropdown remain exactly as they are today. Both the manual admin path and the new automatic heartbeat-driven path call the identical </w:t>
+      </w:r>
+      <w:r>
+        <w:rPr>
+          <w:rFonts w:ascii="Consolas" w:cs="Consolas" w:eastAsia="Consolas" w:hAnsi="Consolas"/>
+          <w:sz w:val="20"/>
+          <w:szCs w:val="20"/>
+        </w:rPr>
+        <w:t xml:space="preserve">continuous.record_event()</w:t>
+      </w:r>
+      <w:r>
+        <w:t xml:space="preserve"> function — nothing about scoring, MFA re-triggering, or revocation logic changes. This is purely about *what causes* an event, never *what an event does*.</w:t>
+      </w:r>
+    </w:p>
+    <w:p>
+      <w:pPr>
+        <w:pStyle w:val="Heading2"/>
+        <w:spacing w:after="160" w:before="320"/>
+      </w:pPr>
+      <w:r>
+        <w:t xml:space="preserve">Audit trail — new `auto` / `admin` source tag — CONFIRMED</w:t>
+      </w:r>
+    </w:p>
+    <w:p>
+      <w:pPr>
+        <w:spacing w:after="160"/>
+      </w:pPr>
+      <w:r>
+        <w:t xml:space="preserve">The existing </w:t>
+      </w:r>
+      <w:r>
+        <w:rPr>
+          <w:rFonts w:ascii="Consolas" w:cs="Consolas" w:eastAsia="Consolas" w:hAnsi="Consolas"/>
+          <w:sz w:val="20"/>
+          <w:szCs w:val="20"/>
+        </w:rPr>
+        <w:t xml:space="preserve">security_events</w:t>
+      </w:r>
+      <w:r>
+        <w:t xml:space="preserve"> table gains one new field recording whether each event was raised automatically by the heartbeat detector or manually by an admin. Surfaced on the existing Security Alerts feed / event history so the audit log itself can demonstrate, honestly, which events were real detections versus manual demo/test clicks — useful both for day-to-day debugging and for the eventual thesis defense.</w:t>
+      </w:r>
+    </w:p>
+    <w:p>
+      <w:pPr>
+        <w:pStyle w:val="Heading2"/>
+        <w:spacing w:after="160" w:before="320"/>
+      </w:pPr>
+      <w:r>
+        <w:t xml:space="preserve">Deployment requirement (not a code change, an infra checklist item)</w:t>
+      </w:r>
+    </w:p>
+    <w:p>
+      <w:pPr>
+        <w:spacing w:after="160"/>
+      </w:pPr>
+      <w:r>
+        <w:t xml:space="preserve">Once deployed somewhere other than localhost, the reverse proxy / load balancer in front of the app (nginx, a cloud load balancer, Cloudflare, etc.) must be configured to forward the real visitor's IP (typically via the </w:t>
+      </w:r>
+      <w:r>
+        <w:rPr>
+          <w:rFonts w:ascii="Consolas" w:cs="Consolas" w:eastAsia="Consolas" w:hAnsi="Consolas"/>
+          <w:sz w:val="20"/>
+          <w:szCs w:val="20"/>
+        </w:rPr>
+        <w:t xml:space="preserve">X-Forwarded-For</w:t>
+      </w:r>
+      <w:r>
+        <w:t xml:space="preserve"> header). The backend already prefers this header over the raw socket address (</w:t>
+      </w:r>
+      <w:r>
+        <w:rPr>
+          <w:rFonts w:ascii="Consolas" w:cs="Consolas" w:eastAsia="Consolas" w:hAnsi="Consolas"/>
+          <w:sz w:val="20"/>
+          <w:szCs w:val="20"/>
+        </w:rPr>
+        <w:t xml:space="preserve">_client_ip()</w:t>
+      </w:r>
+      <w:r>
+        <w:t xml:space="preserve"> in </w:t>
+      </w:r>
+      <w:r>
+        <w:rPr>
+          <w:rFonts w:ascii="Consolas" w:cs="Consolas" w:eastAsia="Consolas" w:hAnsi="Consolas"/>
+          <w:sz w:val="20"/>
+          <w:szCs w:val="20"/>
+        </w:rPr>
+        <w:t xml:space="preserve">sessions.py</w:t>
+      </w:r>
+      <w:r>
+        <w:t xml:space="preserve">) — the remaining work is infra configuration, not application code. Without this, every real visitor would appear to share the proxy's own IP, recreating the same "everyone looks identical" problem localhost has today, in a different shape.</w:t>
+      </w:r>
+    </w:p>
+    <w:p>
+      <w:pPr>
+        <w:pStyle w:val="Heading2"/>
+        <w:spacing w:after="160" w:before="320"/>
+      </w:pPr>
+      <w:r>
+        <w:t xml:space="preserve">Known, accepted limitations (state plainly in the eventual thesis writeup, not hidden)</w:t>
+      </w:r>
+    </w:p>
+    <w:p>
+      <w:pPr>
+        <w:pStyle w:val="ListParagraph"/>
+        <w:numPr>
+          <w:ilvl w:val="0"/>
+          <w:numId w:val="1"/>
+        </w:numPr>
+        <w:spacing w:after="120"/>
+      </w:pPr>
+      <w:r>
+        <w:t xml:space="preserve">A client-supplied IP (via </w:t>
+      </w:r>
+      <w:r>
+        <w:rPr>
+          <w:rFonts w:ascii="Consolas" w:cs="Consolas" w:eastAsia="Consolas" w:hAnsi="Consolas"/>
+          <w:sz w:val="20"/>
+          <w:szCs w:val="20"/>
+        </w:rPr>
+        <w:t xml:space="preserve">X-Forwarded-For</w:t>
+      </w:r>
+      <w:r>
+        <w:t xml:space="preserve">) is only trustworthy behind a properly configured trusted reverse proxy — a client can otherwise forge it. This is a pre-existing limitation shared with today's login-time IP check, not new to this pass.</w:t>
+      </w:r>
+    </w:p>
+    <w:p>
+      <w:pPr>
+        <w:pStyle w:val="ListParagraph"/>
+        <w:numPr>
+          <w:ilvl w:val="0"/>
+          <w:numId w:val="1"/>
+        </w:numPr>
+        <w:spacing w:after="120"/>
+      </w:pPr>
+      <w:r>
+        <w:t xml:space="preserve">Real IP changes are not always malicious — mobile network handoffs and corporate NAT pools can legitimately rotate a real user's visible IP, so some false positives are expected and are an honest tradeoff, not a defect to fully eliminate.</w:t>
+      </w:r>
+    </w:p>
+    <w:p>
+      <w:pPr>
+        <w:pStyle w:val="ListParagraph"/>
+        <w:numPr>
+          <w:ilvl w:val="0"/>
+          <w:numId w:val="1"/>
+        </w:numPr>
+        <w:spacing w:after="120"/>
+      </w:pPr>
+      <w:r>
+        <w:t xml:space="preserve">A backgrounded/minimized browser tab causes browsers to throttle JS timers, so heartbeat cadence — and therefore detection latency — can be worse than the nominal ~20 seconds while a user isn't actively looking at the tab.</w:t>
+      </w:r>
+    </w:p>
+    <w:p>
+      <w:pPr>
+        <w:pStyle w:val="ListParagraph"/>
+        <w:numPr>
+          <w:ilvl w:val="0"/>
+          <w:numId w:val="1"/>
+        </w:numPr>
+        <w:spacing w:after="120"/>
+      </w:pPr>
+      <w:r>
+        <w:t xml:space="preserve">VPN detection remains bounded by whatever is in the configured CIDR lists (Section 6's existing, already-documented limitation) — a real commercial VPN not in that list will not be recognized regardless of this hardening pass.</w:t>
+      </w:r>
+    </w:p>
+    <w:p>
+      <w:pPr>
+        <w:pStyle w:val="ListParagraph"/>
+        <w:numPr>
+          <w:ilvl w:val="0"/>
+          <w:numId w:val="1"/>
+        </w:numPr>
+        <w:spacing w:after="120"/>
+      </w:pPr>
+      <w:r>
+        <w:t xml:space="preserve">On localhost/single-machine development, there is no real second IP to ever observe — genuine end-to-end verification of IP-change/VPN detection requires either a live deployment reached from a genuinely different network, or manually forged </w:t>
+      </w:r>
+      <w:r>
+        <w:rPr>
+          <w:rFonts w:ascii="Consolas" w:cs="Consolas" w:eastAsia="Consolas" w:hAnsi="Consolas"/>
+          <w:sz w:val="20"/>
+          <w:szCs w:val="20"/>
+        </w:rPr>
+        <w:t xml:space="preserve">X-Forwarded-For</w:t>
+      </w:r>
+      <w:r>
+        <w:t xml:space="preserve"> values for a specific demo/test.</w:t>
+      </w:r>
+    </w:p>
+    <w:p>
+      <w:pPr>
+        <w:pStyle w:val="Heading2"/>
+        <w:spacing w:after="160" w:before="320"/>
+      </w:pPr>
+      <w:r>
+        <w:t xml:space="preserve">Testing plan (confirmed approach)</w:t>
+      </w:r>
+    </w:p>
+    <w:p>
+      <w:pPr>
+        <w:pStyle w:val="ListParagraph"/>
+        <w:numPr>
+          <w:ilvl w:val="0"/>
+          <w:numId w:val="1"/>
+        </w:numPr>
+        <w:spacing w:after="120"/>
+      </w:pPr>
+      <w:r>
+        <w:rPr>
+          <w:b/>
+          <w:bCs/>
+        </w:rPr>
+        <w:t xml:space="preserve">Automated (pytest):</w:t>
+      </w:r>
+      <w:r>
+        <w:t xml:space="preserve"> fake a "real" request arriving from a different network by setting the </w:t>
+      </w:r>
+      <w:r>
+        <w:rPr>
+          <w:rFonts w:ascii="Consolas" w:cs="Consolas" w:eastAsia="Consolas" w:hAnsi="Consolas"/>
+          <w:sz w:val="20"/>
+          <w:szCs w:val="20"/>
+        </w:rPr>
+        <w:t xml:space="preserve">X-Forwarded-For</w:t>
+      </w:r>
+      <w:r>
+        <w:t xml:space="preserve"> and/or </w:t>
+      </w:r>
+      <w:r>
+        <w:rPr>
+          <w:rFonts w:ascii="Consolas" w:cs="Consolas" w:eastAsia="Consolas" w:hAnsi="Consolas"/>
+          <w:sz w:val="20"/>
+          <w:szCs w:val="20"/>
+        </w:rPr>
+        <w:t xml:space="preserve">User-Agent</w:t>
+      </w:r>
+      <w:r>
+        <w:t xml:space="preserve"> headers directly on the heartbeat call in the test client — no real network needed. VPN classification is tested the same way, using an address from the existing known-bad-VPN CIDR sample. Request-rate detection is tested by calling the heartbeat/authenticated endpoint in a tight loop within a single test and asserting the threshold trips — no real waiting required.</w:t>
+      </w:r>
+    </w:p>
+    <w:p>
+      <w:pPr>
+        <w:pStyle w:val="ListParagraph"/>
+        <w:numPr>
+          <w:ilvl w:val="0"/>
+          <w:numId w:val="1"/>
+        </w:numPr>
+        <w:spacing w:after="120"/>
+      </w:pPr>
+      <w:r>
+        <w:rPr>
+          <w:b/>
+          <w:bCs/>
+        </w:rPr>
+        <w:t xml:space="preserve">Manual/live verification (once deployed):</w:t>
+      </w:r>
+      <w:r>
+        <w:t xml:space="preserve"> log in normally, then do something genuinely real — turn on an actual VPN client, switch from Wi-Fi to a phone hotspot, or override the User-Agent in browser devtools — and confirm the score visibly updates within roughly one heartbeat interval, on both the admin dashboard and the user's own portal, with no admin Trigger click involved anywhere in the path.</w:t>
+      </w:r>
+    </w:p>
+    <w:p>
+      <w:pPr>
+        <w:pStyle w:val="Heading2"/>
+        <w:spacing w:after="160" w:before="320"/>
+      </w:pPr>
+      <w:r>
+        <w:t xml:space="preserve">Non-decisions / implementation details (left to be decided during implementation, low-stakes)</w:t>
+      </w:r>
+    </w:p>
+    <w:p>
+      <w:pPr>
+        <w:pStyle w:val="ListParagraph"/>
+        <w:numPr>
+          <w:ilvl w:val="0"/>
+          <w:numId w:val="1"/>
+        </w:numPr>
+        <w:spacing w:after="120"/>
+      </w:pPr>
+      <w:r>
+        <w:t xml:space="preserve">Exact default heartbeat interval (proposed: 20 seconds) and exact default request-rate threshold — both env-configurable, not hardcoded, consistent with every other timing/threshold value in this project.</w:t>
+      </w:r>
+    </w:p>
+    <w:p>
+      <w:pPr>
+        <w:pStyle w:val="ListParagraph"/>
+        <w:numPr>
+          <w:ilvl w:val="0"/>
+          <w:numId w:val="1"/>
+        </w:numPr>
+        <w:spacing w:after="120"/>
+      </w:pPr>
+      <w:r>
+        <w:t xml:space="preserve">Exact storage for the "last observed" per-session state (a Redis key, most consistent with this project's existing pattern for other ephemeral session-scoped state, vs. a nullable column) — to be decided during implementation.</w:t>
+      </w:r>
+    </w:p>
+    <w:p>
+      <w:pPr>
+        <w:pStyle w:val="ListParagraph"/>
+        <w:numPr>
+          <w:ilvl w:val="0"/>
+          <w:numId w:val="1"/>
+        </w:numPr>
+        <w:spacing w:after="120"/>
+      </w:pPr>
+      <w:r>
+        <w:t xml:space="preserve">Whether a missed/late heartbeat should itself be treated as anything (current default assumption: no — a missed heartbeat is not itself suspicious; true inactivity/disconnection is already handled by the existing Module 3 idle-timeout sweep). Confirm or override during implementation if this needs to change.</w:t>
+      </w:r>
+    </w:p>
+    <w:p>
+      <w:pPr>
+        <w:pStyle w:val="ListParagraph"/>
+        <w:numPr>
+          <w:ilvl w:val="0"/>
+          <w:numId w:val="1"/>
+        </w:numPr>
+        <w:spacing w:after="120"/>
+      </w:pPr>
+      <w:r>
+        <w:t xml:space="preserve">Exact new heartbeat endpoint shape/path and exact request-rate counting implementation (e.g. a lightweight dependency incrementing a Redis counter on every authenticated call vs. counting heartbeats specifically) — to be worked out during implementation, following this project's existing Redis fail-open conventions.</w:t>
+      </w:r>
+    </w:p>
+    <w:p>
+      <w:pPr>
+        <w:pStyle w:val="Heading2"/>
+        <w:spacing w:after="160" w:before="320"/>
+      </w:pPr>
+      <w:r>
+        <w:t xml:space="preserve">Scope size — set expectations correctly</w:t>
+      </w:r>
+    </w:p>
+    <w:p>
+      <w:pPr>
+        <w:spacing w:after="160"/>
+      </w:pPr>
+      <w:r>
+        <w:t xml:space="preserve">This is a genuinely new moving part, not a small tweak — comparable in size to the account-level risk lockout plus both live-score-display fixes combined (</w:t>
+      </w:r>
+      <w:r>
+        <w:rPr>
+          <w:rFonts w:ascii="Consolas" w:cs="Consolas" w:eastAsia="Consolas" w:hAnsi="Consolas"/>
+          <w:sz w:val="20"/>
+          <w:szCs w:val="20"/>
+        </w:rPr>
+        <w:t xml:space="preserve">Project status.md</w:t>
+      </w:r>
+      <w:r>
+        <w:t xml:space="preserve"> sections 18–20). It needs: a new authenticated endpoint, new per-session "last observed" state, a new frontend timer, a new audit-trail field, and full new test coverage. It deserves the same careful, fully-specified-before-code treatment already used for the risk lockout, which this section is intended to provide.</w:t>
       </w:r>
     </w:p>
     <w:sectPr>
-      <w:pgSz w:w="12240" w:h="15840" w:orient="portrait"/>
+      <w:pgSz w:w="11906" w:h="16838" w:orient="portrait"/>
       <w:pgMar w:top="1440" w:right="1440" w:bottom="1440" w:left="1440" w:header="708" w:footer="708" w:gutter="0"/>
       <w:pgNumType/>
       <w:docGrid w:linePitch="360"/>
@@ -4749,13 +5366,7 @@
 <file path=word/styles.xml><?xml version="1.0" encoding="utf-8"?>
 <w:styles xmlns:mc="http://schemas.openxmlformats.org/markup-compatibility/2006" xmlns:r="http://schemas.openxmlformats.org/officeDocument/2006/relationships" xmlns:w="http://schemas.openxmlformats.org/wordprocessingml/2006/main" xmlns:w14="http://schemas.microsoft.com/office/word/2010/wordml" xmlns:w15="http://schemas.microsoft.com/office/word/2012/wordml" mc:Ignorable="w14 w15">
   <w:docDefaults>
-    <w:rPrDefault>
-      <w:rPr>
-        <w:rFonts w:ascii="Calibri" w:cs="Calibri" w:eastAsia="Calibri" w:hAnsi="Calibri"/>
-        <w:sz w:val="22"/>
-        <w:szCs w:val="22"/>
-      </w:rPr>
-    </w:rPrDefault>
+    <w:rPrDefault/>
     <w:pPrDefault/>
   </w:docDefaults>
   <w:style w:type="paragraph" w:styleId="Title">
@@ -4929,53 +5540,5 @@
       <w:szCs w:val="20"/>
     </w:rPr>
   </w:style>
-  <w:style w:type="paragraph" w:styleId="Title">
-    <w:name w:val="Title"/>
-    <w:basedOn w:val="Normal"/>
-    <w:next w:val="Normal"/>
-    <w:pPr>
-      <w:spacing w:after="300"/>
-    </w:pPr>
-    <w:rPr>
-      <w:b/>
-      <w:bCs/>
-      <w:color w:val="1F3864"/>
-      <w:sz w:val="40"/>
-      <w:szCs w:val="40"/>
-    </w:rPr>
-  </w:style>
-  <w:style w:type="paragraph" w:styleId="Heading1">
-    <w:name w:val="Heading 1"/>
-    <w:basedOn w:val="Normal"/>
-    <w:next w:val="Normal"/>
-    <w:pPr>
-      <w:pBdr>
-        <w:bottom w:val="single" w:color="1F3864" w:sz="6" w:space="4"/>
-      </w:pBdr>
-      <w:spacing w:after="160" w:before="320"/>
-    </w:pPr>
-    <w:rPr>
-      <w:b/>
-      <w:bCs/>
-      <w:color w:val="1F3864"/>
-      <w:sz w:val="28"/>
-      <w:szCs w:val="28"/>
-    </w:rPr>
-  </w:style>
-  <w:style w:type="paragraph" w:styleId="Heading2">
-    <w:name w:val="Heading 2"/>
-    <w:basedOn w:val="Normal"/>
-    <w:next w:val="Normal"/>
-    <w:pPr>
-      <w:spacing w:after="120" w:before="200"/>
-    </w:pPr>
-    <w:rPr>
-      <w:b/>
-      <w:bCs/>
-      <w:color w:val="2E5395"/>
-      <w:sz w:val="24"/>
-      <w:szCs w:val="24"/>
-    </w:rPr>
-  </w:style>
 </w:styles>
 </file>
</xml_diff>